<commit_message>
docs: add project diary and refresh proposal package
</commit_message>
<xml_diff>
--- a/business/generated/사업계획서_PULSE_2026_최종제출본.docx
+++ b/business/generated/사업계획서_PULSE_2026_최종제출본.docx
@@ -1259,6 +1259,7 @@
                                 </w:rPr>
                                 <w:t xml:space="preserve"> </w:t>
                               </w:r>
+                              <w:proofErr w:type="spellStart"/>
                               <w:r>
                                 <w:rPr>
                                   <w:rFonts w:ascii="맑은 고딕" w:eastAsia="맑은 고딕" w:hAnsi="맑은 고딕"/>
@@ -1267,6 +1268,7 @@
                                 </w:rPr>
                                 <w:t>마스킹하여</w:t>
                               </w:r>
+                              <w:proofErr w:type="spellEnd"/>
                               <w:r>
                                 <w:rPr>
                                   <w:rFonts w:ascii="맑은 고딕" w:eastAsia="맑은 고딕" w:hAnsi="맑은 고딕"/>
@@ -2867,7 +2869,7 @@
                 <w:rFonts w:ascii="맑은 고딕" w:eastAsia="맑은 고딕" w:hAnsi="맑은 고딕"/>
                 <w:sz w:val="20"/>
               </w:rPr>
-              <w:t>네이버·카카오 리뷰 분석 기반 외식업 AI 마케팅 운영 플랫폼 PULSE</w:t>
+              <w:t>리뷰 분석 기반 외식업 AI 마케팅 운영 플랫폼 PULSE</w:t>
             </w:r>
           </w:p>
         </w:tc>
@@ -2953,7 +2955,23 @@
                 <w:rFonts w:ascii="맑은 고딕" w:eastAsia="맑은 고딕" w:hAnsi="맑은 고딕"/>
                 <w:sz w:val="20"/>
               </w:rPr>
-              <w:t>웹 서비스(1식), 네이버·카카오 리뷰 수집 및 분석 기능(1식), 고객 페르소나·고객 여정 도출 기능(1식), AI 숏폼 생성 기능(1식), 실행 제안형 대시보드 및 상권 분석 기능(1식)</w:t>
+              <w:t xml:space="preserve">웹 서비스(1식), 네이버·카카오 리뷰 수집 및 분석 기능(1식), 고객 페르소나·고객 여정 도출 기능(1식), AI </w:t>
+            </w:r>
+            <w:proofErr w:type="spellStart"/>
+            <w:r>
+              <w:rPr>
+                <w:rFonts w:ascii="맑은 고딕" w:eastAsia="맑은 고딕" w:hAnsi="맑은 고딕"/>
+                <w:sz w:val="20"/>
+              </w:rPr>
+              <w:t>숏폼</w:t>
+            </w:r>
+            <w:proofErr w:type="spellEnd"/>
+            <w:r>
+              <w:rPr>
+                <w:rFonts w:ascii="맑은 고딕" w:eastAsia="맑은 고딕" w:hAnsi="맑은 고딕"/>
+                <w:sz w:val="20"/>
+              </w:rPr>
+              <w:t xml:space="preserve"> 생성 기능(1식), 실행 제안형 대시보드 및 상권 분석 기능(1식)</w:t>
             </w:r>
           </w:p>
         </w:tc>
@@ -3039,7 +3057,23 @@
                 <w:rFonts w:ascii="맑은 고딕" w:eastAsia="맑은 고딕" w:hAnsi="맑은 고딕"/>
                 <w:sz w:val="20"/>
               </w:rPr>
-              <w:t>대학생(4학년 재학) / AI·CTO</w:t>
+              <w:t>대학생(4학년 재학</w:t>
+            </w:r>
+            <w:proofErr w:type="gramStart"/>
+            <w:r>
+              <w:rPr>
+                <w:rFonts w:ascii="맑은 고딕" w:eastAsia="맑은 고딕" w:hAnsi="맑은 고딕"/>
+                <w:sz w:val="20"/>
+              </w:rPr>
+              <w:t>) /</w:t>
+            </w:r>
+            <w:proofErr w:type="gramEnd"/>
+            <w:r>
+              <w:rPr>
+                <w:rFonts w:ascii="맑은 고딕" w:eastAsia="맑은 고딕" w:hAnsi="맑은 고딕"/>
+                <w:sz w:val="20"/>
+              </w:rPr>
+              <w:t xml:space="preserve"> AI·CTO</w:t>
             </w:r>
           </w:p>
         </w:tc>
@@ -3099,6 +3133,7 @@
                 <w:rFonts w:ascii="맑은 고딕" w:eastAsia="맑은 고딕" w:hAnsi="맑은 고딕"/>
                 <w:b/>
                 <w:bCs/>
+                <w:iCs/>
                 <w:shd w:val="clear" w:color="auto" w:fill="auto"/>
               </w:rPr>
             </w:pPr>
@@ -3107,7 +3142,7 @@
                 <w:rFonts w:ascii="맑은 고딕" w:eastAsia="맑은 고딕" w:hAnsi="맑은 고딕" w:hint="eastAsia"/>
                 <w:b/>
                 <w:bCs/>
-                <w:i/>
+                <w:iCs/>
                 <w:color w:val="000000" w:themeColor="text1"/>
                 <w:shd w:val="clear" w:color="auto" w:fill="auto"/>
               </w:rPr>
@@ -3150,7 +3185,25 @@
                 <w:b/>
                 <w:shd w:val="clear" w:color="auto" w:fill="auto"/>
               </w:rPr>
-              <w:t xml:space="preserve">(예비)창업팀 구성 현황 </w:t>
+              <w:t>(예비)</w:t>
+            </w:r>
+            <w:proofErr w:type="spellStart"/>
+            <w:r>
+              <w:rPr>
+                <w:rFonts w:ascii="맑은 고딕" w:eastAsia="맑은 고딕" w:hAnsi="맑은 고딕"/>
+                <w:b/>
+                <w:shd w:val="clear" w:color="auto" w:fill="auto"/>
+              </w:rPr>
+              <w:t>창업팀</w:t>
+            </w:r>
+            <w:proofErr w:type="spellEnd"/>
+            <w:r>
+              <w:rPr>
+                <w:rFonts w:ascii="맑은 고딕" w:eastAsia="맑은 고딕" w:hAnsi="맑은 고딕"/>
+                <w:b/>
+                <w:shd w:val="clear" w:color="auto" w:fill="auto"/>
+              </w:rPr>
+              <w:t xml:space="preserve"> 구성 현황 </w:t>
             </w:r>
             <w:r>
               <w:rPr>
@@ -3451,14 +3504,46 @@
                 <w:rFonts w:ascii="맑은 고딕" w:eastAsia="맑은 고딕" w:hAnsi="맑은 고딕"/>
                 <w:sz w:val="20"/>
               </w:rPr>
-              <w:t>노*경</w:t>
-            </w:r>
-            <w:r>
-              <w:rPr>
-                <w:rFonts w:ascii="맑은 고딕" w:eastAsia="맑은 고딕" w:hAnsi="맑은 고딕"/>
-                <w:sz w:val="20"/>
-              </w:rPr>
-              <w:t xml:space="preserve"> / 대학교 4학년 재학 / 서비스 기획, 마케팅 설계, 디자인 역량</w:t>
+              <w:t>노*</w:t>
+            </w:r>
+            <w:proofErr w:type="gramStart"/>
+            <w:r>
+              <w:rPr>
+                <w:rFonts w:ascii="맑은 고딕" w:eastAsia="맑은 고딕" w:hAnsi="맑은 고딕"/>
+                <w:sz w:val="20"/>
+              </w:rPr>
+              <w:t>경</w:t>
+            </w:r>
+            <w:r>
+              <w:rPr>
+                <w:rFonts w:ascii="맑은 고딕" w:eastAsia="맑은 고딕" w:hAnsi="맑은 고딕"/>
+                <w:sz w:val="20"/>
+              </w:rPr>
+              <w:t xml:space="preserve"> /</w:t>
+            </w:r>
+            <w:proofErr w:type="gramEnd"/>
+            <w:r>
+              <w:rPr>
+                <w:rFonts w:ascii="맑은 고딕" w:eastAsia="맑은 고딕" w:hAnsi="맑은 고딕"/>
+                <w:sz w:val="20"/>
+              </w:rPr>
+              <w:t xml:space="preserve"> 대학교 4학년 </w:t>
+            </w:r>
+            <w:proofErr w:type="gramStart"/>
+            <w:r>
+              <w:rPr>
+                <w:rFonts w:ascii="맑은 고딕" w:eastAsia="맑은 고딕" w:hAnsi="맑은 고딕"/>
+                <w:sz w:val="20"/>
+              </w:rPr>
+              <w:t>재학 /</w:t>
+            </w:r>
+            <w:proofErr w:type="gramEnd"/>
+            <w:r>
+              <w:rPr>
+                <w:rFonts w:ascii="맑은 고딕" w:eastAsia="맑은 고딕" w:hAnsi="맑은 고딕"/>
+                <w:sz w:val="20"/>
+              </w:rPr>
+              <w:t xml:space="preserve"> 서비스 기획, 마케팅 설계, 디자인 역량</w:t>
             </w:r>
           </w:p>
         </w:tc>
@@ -3567,12 +3652,21 @@
                 <w:sz w:val="20"/>
               </w:rPr>
             </w:pPr>
-            <w:r>
-              <w:rPr>
-                <w:rFonts w:ascii="맑은 고딕" w:eastAsia="맑은 고딕" w:hAnsi="맑은 고딕"/>
-                <w:sz w:val="20"/>
-              </w:rPr>
-              <w:t>프론트엔드 개발</w:t>
+            <w:proofErr w:type="spellStart"/>
+            <w:r>
+              <w:rPr>
+                <w:rFonts w:ascii="맑은 고딕" w:eastAsia="맑은 고딕" w:hAnsi="맑은 고딕"/>
+                <w:sz w:val="20"/>
+              </w:rPr>
+              <w:t>프론트엔드</w:t>
+            </w:r>
+            <w:proofErr w:type="spellEnd"/>
+            <w:r>
+              <w:rPr>
+                <w:rFonts w:ascii="맑은 고딕" w:eastAsia="맑은 고딕" w:hAnsi="맑은 고딕"/>
+                <w:sz w:val="20"/>
+              </w:rPr>
+              <w:t xml:space="preserve"> 개발</w:t>
             </w:r>
           </w:p>
         </w:tc>
@@ -3600,14 +3694,46 @@
                 <w:rFonts w:ascii="맑은 고딕" w:eastAsia="맑은 고딕" w:hAnsi="맑은 고딕"/>
                 <w:sz w:val="20"/>
               </w:rPr>
-              <w:t>김*린</w:t>
-            </w:r>
-            <w:r>
-              <w:rPr>
-                <w:rFonts w:ascii="맑은 고딕" w:eastAsia="맑은 고딕" w:hAnsi="맑은 고딕"/>
-                <w:sz w:val="20"/>
-              </w:rPr>
-              <w:t xml:space="preserve"> / 대학교 4학년 재학 / React 기반 UI 구현 및 사용자 경험 설계 역량</w:t>
+              <w:t>김*</w:t>
+            </w:r>
+            <w:proofErr w:type="gramStart"/>
+            <w:r>
+              <w:rPr>
+                <w:rFonts w:ascii="맑은 고딕" w:eastAsia="맑은 고딕" w:hAnsi="맑은 고딕"/>
+                <w:sz w:val="20"/>
+              </w:rPr>
+              <w:t>린</w:t>
+            </w:r>
+            <w:r>
+              <w:rPr>
+                <w:rFonts w:ascii="맑은 고딕" w:eastAsia="맑은 고딕" w:hAnsi="맑은 고딕"/>
+                <w:sz w:val="20"/>
+              </w:rPr>
+              <w:t xml:space="preserve"> /</w:t>
+            </w:r>
+            <w:proofErr w:type="gramEnd"/>
+            <w:r>
+              <w:rPr>
+                <w:rFonts w:ascii="맑은 고딕" w:eastAsia="맑은 고딕" w:hAnsi="맑은 고딕"/>
+                <w:sz w:val="20"/>
+              </w:rPr>
+              <w:t xml:space="preserve"> 대학교 4학년 </w:t>
+            </w:r>
+            <w:proofErr w:type="gramStart"/>
+            <w:r>
+              <w:rPr>
+                <w:rFonts w:ascii="맑은 고딕" w:eastAsia="맑은 고딕" w:hAnsi="맑은 고딕"/>
+                <w:sz w:val="20"/>
+              </w:rPr>
+              <w:t>재학 /</w:t>
+            </w:r>
+            <w:proofErr w:type="gramEnd"/>
+            <w:r>
+              <w:rPr>
+                <w:rFonts w:ascii="맑은 고딕" w:eastAsia="맑은 고딕" w:hAnsi="맑은 고딕"/>
+                <w:sz w:val="20"/>
+              </w:rPr>
+              <w:t xml:space="preserve"> React 기반 UI 구현 및 사용자 경험 설계 역량</w:t>
             </w:r>
           </w:p>
         </w:tc>
@@ -3716,12 +3842,21 @@
                 <w:sz w:val="20"/>
               </w:rPr>
             </w:pPr>
-            <w:r>
-              <w:rPr>
-                <w:rFonts w:ascii="맑은 고딕" w:eastAsia="맑은 고딕" w:hAnsi="맑은 고딕"/>
-                <w:sz w:val="20"/>
-              </w:rPr>
-              <w:t>백엔드 개발</w:t>
+            <w:proofErr w:type="spellStart"/>
+            <w:r>
+              <w:rPr>
+                <w:rFonts w:ascii="맑은 고딕" w:eastAsia="맑은 고딕" w:hAnsi="맑은 고딕"/>
+                <w:sz w:val="20"/>
+              </w:rPr>
+              <w:t>백엔드</w:t>
+            </w:r>
+            <w:proofErr w:type="spellEnd"/>
+            <w:r>
+              <w:rPr>
+                <w:rFonts w:ascii="맑은 고딕" w:eastAsia="맑은 고딕" w:hAnsi="맑은 고딕"/>
+                <w:sz w:val="20"/>
+              </w:rPr>
+              <w:t xml:space="preserve"> 개발</w:t>
             </w:r>
           </w:p>
         </w:tc>
@@ -3749,14 +3884,46 @@
                 <w:rFonts w:ascii="맑은 고딕" w:eastAsia="맑은 고딕" w:hAnsi="맑은 고딕"/>
                 <w:sz w:val="20"/>
               </w:rPr>
-              <w:t>오*서</w:t>
-            </w:r>
-            <w:r>
-              <w:rPr>
-                <w:rFonts w:ascii="맑은 고딕" w:eastAsia="맑은 고딕" w:hAnsi="맑은 고딕"/>
-                <w:sz w:val="20"/>
-              </w:rPr>
-              <w:t xml:space="preserve"> / 대학교 4학년 재학 / Spring Boot 기반 API 및 서버 연동 역량</w:t>
+              <w:t>오*</w:t>
+            </w:r>
+            <w:proofErr w:type="gramStart"/>
+            <w:r>
+              <w:rPr>
+                <w:rFonts w:ascii="맑은 고딕" w:eastAsia="맑은 고딕" w:hAnsi="맑은 고딕"/>
+                <w:sz w:val="20"/>
+              </w:rPr>
+              <w:t>서</w:t>
+            </w:r>
+            <w:r>
+              <w:rPr>
+                <w:rFonts w:ascii="맑은 고딕" w:eastAsia="맑은 고딕" w:hAnsi="맑은 고딕"/>
+                <w:sz w:val="20"/>
+              </w:rPr>
+              <w:t xml:space="preserve"> /</w:t>
+            </w:r>
+            <w:proofErr w:type="gramEnd"/>
+            <w:r>
+              <w:rPr>
+                <w:rFonts w:ascii="맑은 고딕" w:eastAsia="맑은 고딕" w:hAnsi="맑은 고딕"/>
+                <w:sz w:val="20"/>
+              </w:rPr>
+              <w:t xml:space="preserve"> 대학교 4학년 </w:t>
+            </w:r>
+            <w:proofErr w:type="gramStart"/>
+            <w:r>
+              <w:rPr>
+                <w:rFonts w:ascii="맑은 고딕" w:eastAsia="맑은 고딕" w:hAnsi="맑은 고딕"/>
+                <w:sz w:val="20"/>
+              </w:rPr>
+              <w:t>재학 /</w:t>
+            </w:r>
+            <w:proofErr w:type="gramEnd"/>
+            <w:r>
+              <w:rPr>
+                <w:rFonts w:ascii="맑은 고딕" w:eastAsia="맑은 고딕" w:hAnsi="맑은 고딕"/>
+                <w:sz w:val="20"/>
+              </w:rPr>
+              <w:t xml:space="preserve"> Spring Boot 기반 API 및 서버 연동 역량</w:t>
             </w:r>
           </w:p>
         </w:tc>
@@ -4346,12 +4513,37 @@
                 <w:sz w:val="20"/>
               </w:rPr>
             </w:pPr>
-            <w:r>
-              <w:rPr>
-                <w:rFonts w:ascii="맑은 고딕" w:eastAsia="맑은 고딕" w:hAnsi="맑은 고딕"/>
-                <w:sz w:val="20"/>
-              </w:rPr>
-              <w:t>프론트엔드, 메인 백엔드, AI 서버로 구성된 MVP 개발이 완료되었고, 네이버·카카오 리뷰 수집, 토픽 분석, 고객 페르소나·고객 여정 생성, 대시보드와 영상 제작 UX까지 시연 가능한 상태입니다.</w:t>
+            <w:proofErr w:type="spellStart"/>
+            <w:r>
+              <w:rPr>
+                <w:rFonts w:ascii="맑은 고딕" w:eastAsia="맑은 고딕" w:hAnsi="맑은 고딕"/>
+                <w:sz w:val="20"/>
+              </w:rPr>
+              <w:t>프론트엔드</w:t>
+            </w:r>
+            <w:proofErr w:type="spellEnd"/>
+            <w:r>
+              <w:rPr>
+                <w:rFonts w:ascii="맑은 고딕" w:eastAsia="맑은 고딕" w:hAnsi="맑은 고딕"/>
+                <w:sz w:val="20"/>
+              </w:rPr>
+              <w:t xml:space="preserve">, 메인 </w:t>
+            </w:r>
+            <w:proofErr w:type="spellStart"/>
+            <w:r>
+              <w:rPr>
+                <w:rFonts w:ascii="맑은 고딕" w:eastAsia="맑은 고딕" w:hAnsi="맑은 고딕"/>
+                <w:sz w:val="20"/>
+              </w:rPr>
+              <w:t>백엔드</w:t>
+            </w:r>
+            <w:proofErr w:type="spellEnd"/>
+            <w:r>
+              <w:rPr>
+                <w:rFonts w:ascii="맑은 고딕" w:eastAsia="맑은 고딕" w:hAnsi="맑은 고딕"/>
+                <w:sz w:val="20"/>
+              </w:rPr>
+              <w:t>, AI 서버로 구성된 MVP 개발이 완료되었고, 네이버·카카오 리뷰 수집, 토픽 분석, 고객 페르소나·고객 여정 생성, 대시보드와 영상 제작 UX까지 시연 가능한 상태입니다.</w:t>
             </w:r>
           </w:p>
         </w:tc>
@@ -4458,7 +4650,39 @@
                 <w:rFonts w:ascii="맑은 고딕" w:eastAsia="맑은 고딕" w:hAnsi="맑은 고딕"/>
                 <w:sz w:val="20"/>
               </w:rPr>
-              <w:t>파일럿 점포를 통한 PoC 운영으로 현장성을 검증한 뒤 구독형 SaaS 모델을 검증하고, 향후 리뷰 운영, 인플루언서 매칭, 다점포 관리, B2B 제휴 영역으로 확장합니다.</w:t>
+              <w:t xml:space="preserve">파일럿 점포를 통한 PoC 운영으로 현장성을 검증한 뒤 구독형 SaaS 모델을 검증하고, 향후 리뷰 운영, </w:t>
+            </w:r>
+            <w:proofErr w:type="spellStart"/>
+            <w:r>
+              <w:rPr>
+                <w:rFonts w:ascii="맑은 고딕" w:eastAsia="맑은 고딕" w:hAnsi="맑은 고딕"/>
+                <w:sz w:val="20"/>
+              </w:rPr>
+              <w:t>인플루언서</w:t>
+            </w:r>
+            <w:proofErr w:type="spellEnd"/>
+            <w:r>
+              <w:rPr>
+                <w:rFonts w:ascii="맑은 고딕" w:eastAsia="맑은 고딕" w:hAnsi="맑은 고딕"/>
+                <w:sz w:val="20"/>
+              </w:rPr>
+              <w:t xml:space="preserve"> 매칭, </w:t>
+            </w:r>
+            <w:proofErr w:type="spellStart"/>
+            <w:r>
+              <w:rPr>
+                <w:rFonts w:ascii="맑은 고딕" w:eastAsia="맑은 고딕" w:hAnsi="맑은 고딕"/>
+                <w:sz w:val="20"/>
+              </w:rPr>
+              <w:t>다점포</w:t>
+            </w:r>
+            <w:proofErr w:type="spellEnd"/>
+            <w:r>
+              <w:rPr>
+                <w:rFonts w:ascii="맑은 고딕" w:eastAsia="맑은 고딕" w:hAnsi="맑은 고딕"/>
+                <w:sz w:val="20"/>
+              </w:rPr>
+              <w:t xml:space="preserve"> 관리, B2B 제휴 영역으로 확장합니다.</w:t>
             </w:r>
           </w:p>
         </w:tc>
@@ -4609,7 +4833,23 @@
                 <w:rFonts w:ascii="맑은 고딕" w:eastAsia="맑은 고딕" w:hAnsi="맑은 고딕"/>
                 <w:sz w:val="20"/>
               </w:rPr>
-              <w:t xml:space="preserve">(프론트엔드), </w:t>
+              <w:t>(</w:t>
+            </w:r>
+            <w:proofErr w:type="spellStart"/>
+            <w:r>
+              <w:rPr>
+                <w:rFonts w:ascii="맑은 고딕" w:eastAsia="맑은 고딕" w:hAnsi="맑은 고딕"/>
+                <w:sz w:val="20"/>
+              </w:rPr>
+              <w:t>프론트엔드</w:t>
+            </w:r>
+            <w:proofErr w:type="spellEnd"/>
+            <w:r>
+              <w:rPr>
+                <w:rFonts w:ascii="맑은 고딕" w:eastAsia="맑은 고딕" w:hAnsi="맑은 고딕"/>
+                <w:sz w:val="20"/>
+              </w:rPr>
+              <w:t xml:space="preserve">), </w:t>
             </w:r>
             <w:r>
               <w:rPr>
@@ -4623,7 +4863,23 @@
                 <w:rFonts w:ascii="맑은 고딕" w:eastAsia="맑은 고딕" w:hAnsi="맑은 고딕"/>
                 <w:sz w:val="20"/>
               </w:rPr>
-              <w:t>(백엔드)가 공동대표로 참여하는 역할 분담형 팀 구조로 MVP를 직접 구축했습니다.</w:t>
+              <w:t>(</w:t>
+            </w:r>
+            <w:proofErr w:type="spellStart"/>
+            <w:r>
+              <w:rPr>
+                <w:rFonts w:ascii="맑은 고딕" w:eastAsia="맑은 고딕" w:hAnsi="맑은 고딕"/>
+                <w:sz w:val="20"/>
+              </w:rPr>
+              <w:t>백엔드</w:t>
+            </w:r>
+            <w:proofErr w:type="spellEnd"/>
+            <w:r>
+              <w:rPr>
+                <w:rFonts w:ascii="맑은 고딕" w:eastAsia="맑은 고딕" w:hAnsi="맑은 고딕"/>
+                <w:sz w:val="20"/>
+              </w:rPr>
+              <w:t>)가 공동대표로 참여하는 역할 분담형 팀 구조로 MVP를 직접 구축했습니다.</w:t>
             </w:r>
           </w:p>
         </w:tc>
@@ -5951,12 +6207,30 @@
           <w:szCs w:val="28"/>
         </w:rPr>
       </w:pPr>
+      <w:proofErr w:type="spellStart"/>
       <w:r>
         <w:rPr>
           <w:rFonts w:ascii="맑은 고딕" w:eastAsia="맑은 고딕" w:hAnsi="맑은 고딕"/>
           <w:sz w:val="20"/>
         </w:rPr>
-        <w:t>ㅇ 아이템 개요</w:t>
+        <w:t>ㅇ</w:t>
+      </w:r>
+      <w:proofErr w:type="spellEnd"/>
+      <w:r>
+        <w:rPr>
+          <w:rFonts w:ascii="맑은 고딕" w:eastAsia="맑은 고딕" w:hAnsi="맑은 고딕"/>
+          <w:sz w:val="20"/>
+        </w:rPr>
+        <w:t xml:space="preserve"> </w:t>
+      </w:r>
+      <w:r>
+        <w:rPr>
+          <w:rFonts w:ascii="맑은 고딕" w:eastAsia="맑은 고딕" w:hAnsi="맑은 고딕"/>
+          <w:b/>
+          <w:bCs/>
+          <w:sz w:val="20"/>
+        </w:rPr>
+        <w:t>아이템 개요</w:t>
       </w:r>
     </w:p>
     <w:p>
@@ -6012,12 +6286,30 @@
           <w:szCs w:val="28"/>
         </w:rPr>
       </w:pPr>
+      <w:proofErr w:type="spellStart"/>
       <w:r>
         <w:rPr>
           <w:rFonts w:ascii="맑은 고딕" w:eastAsia="맑은 고딕" w:hAnsi="맑은 고딕"/>
           <w:sz w:val="20"/>
         </w:rPr>
-        <w:t>ㅇ 문제 인식 (Problem)</w:t>
+        <w:t>ㅇ</w:t>
+      </w:r>
+      <w:proofErr w:type="spellEnd"/>
+      <w:r>
+        <w:rPr>
+          <w:rFonts w:ascii="맑은 고딕" w:eastAsia="맑은 고딕" w:hAnsi="맑은 고딕"/>
+          <w:sz w:val="20"/>
+        </w:rPr>
+        <w:t xml:space="preserve"> </w:t>
+      </w:r>
+      <w:r>
+        <w:rPr>
+          <w:rFonts w:ascii="맑은 고딕" w:eastAsia="맑은 고딕" w:hAnsi="맑은 고딕"/>
+          <w:b/>
+          <w:bCs/>
+          <w:sz w:val="20"/>
+        </w:rPr>
+        <w:t>문제 인식 (Problem)</w:t>
       </w:r>
     </w:p>
     <w:p>
@@ -6074,18 +6366,44 @@
     <w:p>
       <w:pPr>
         <w:rPr>
+          <w:rFonts w:ascii="맑은 고딕" w:eastAsia="맑은 고딕" w:hAnsi="맑은 고딕"/>
+          <w:sz w:val="20"/>
+        </w:rPr>
+      </w:pPr>
+    </w:p>
+    <w:p>
+      <w:pPr>
+        <w:rPr>
           <w:rFonts w:ascii="맑은 고딕" w:eastAsia="맑은 고딕" w:hAnsi="맑은 고딕" w:cs="굴림"/>
           <w:color w:val="000000"/>
           <w:sz w:val="20"/>
           <w:szCs w:val="28"/>
         </w:rPr>
       </w:pPr>
+      <w:proofErr w:type="spellStart"/>
       <w:r>
         <w:rPr>
           <w:rFonts w:ascii="맑은 고딕" w:eastAsia="맑은 고딕" w:hAnsi="맑은 고딕"/>
           <w:sz w:val="20"/>
         </w:rPr>
-        <w:t>ㅇ 실현 가능성 (Solution)</w:t>
+        <w:t>ㅇ</w:t>
+      </w:r>
+      <w:proofErr w:type="spellEnd"/>
+      <w:r>
+        <w:rPr>
+          <w:rFonts w:ascii="맑은 고딕" w:eastAsia="맑은 고딕" w:hAnsi="맑은 고딕"/>
+          <w:sz w:val="20"/>
+        </w:rPr>
+        <w:t xml:space="preserve"> </w:t>
+      </w:r>
+      <w:r>
+        <w:rPr>
+          <w:rFonts w:ascii="맑은 고딕" w:eastAsia="맑은 고딕" w:hAnsi="맑은 고딕"/>
+          <w:b/>
+          <w:bCs/>
+          <w:sz w:val="20"/>
+        </w:rPr>
+        <w:t>실현 가능성 (Solution)</w:t>
       </w:r>
     </w:p>
     <w:p>
@@ -6100,7 +6418,55 @@
           <w:rFonts w:ascii="맑은 고딕" w:eastAsia="맑은 고딕" w:hAnsi="맑은 고딕"/>
           <w:sz w:val="20"/>
         </w:rPr>
-        <w:t>PULSE는 React 프론트엔드, Spring Boot 메인 백엔드, FastAPI AI 서버로 구현되었으며, 회원가입 직후 리뷰 분석이 자동 시작되는 구조를 갖춘 MVP로 실제 사용자 흐름에 따라 시연이 가능합니다.</w:t>
+        <w:t xml:space="preserve">PULSE는 React </w:t>
+      </w:r>
+      <w:proofErr w:type="spellStart"/>
+      <w:r>
+        <w:rPr>
+          <w:rFonts w:ascii="맑은 고딕" w:eastAsia="맑은 고딕" w:hAnsi="맑은 고딕"/>
+          <w:sz w:val="20"/>
+        </w:rPr>
+        <w:t>프론트엔드</w:t>
+      </w:r>
+      <w:proofErr w:type="spellEnd"/>
+      <w:r>
+        <w:rPr>
+          <w:rFonts w:ascii="맑은 고딕" w:eastAsia="맑은 고딕" w:hAnsi="맑은 고딕"/>
+          <w:sz w:val="20"/>
+        </w:rPr>
+        <w:t xml:space="preserve">, Spring Boot 메인 </w:t>
+      </w:r>
+      <w:proofErr w:type="spellStart"/>
+      <w:r>
+        <w:rPr>
+          <w:rFonts w:ascii="맑은 고딕" w:eastAsia="맑은 고딕" w:hAnsi="맑은 고딕"/>
+          <w:sz w:val="20"/>
+        </w:rPr>
+        <w:t>백엔드</w:t>
+      </w:r>
+      <w:proofErr w:type="spellEnd"/>
+      <w:r>
+        <w:rPr>
+          <w:rFonts w:ascii="맑은 고딕" w:eastAsia="맑은 고딕" w:hAnsi="맑은 고딕"/>
+          <w:sz w:val="20"/>
+        </w:rPr>
+        <w:t xml:space="preserve">, </w:t>
+      </w:r>
+      <w:proofErr w:type="spellStart"/>
+      <w:r>
+        <w:rPr>
+          <w:rFonts w:ascii="맑은 고딕" w:eastAsia="맑은 고딕" w:hAnsi="맑은 고딕"/>
+          <w:sz w:val="20"/>
+        </w:rPr>
+        <w:t>FastAPI</w:t>
+      </w:r>
+      <w:proofErr w:type="spellEnd"/>
+      <w:r>
+        <w:rPr>
+          <w:rFonts w:ascii="맑은 고딕" w:eastAsia="맑은 고딕" w:hAnsi="맑은 고딕"/>
+          <w:sz w:val="20"/>
+        </w:rPr>
+        <w:t xml:space="preserve"> AI 서버로 구현되었으며, 회원가입 직후 리뷰 분석이 자동 시작되는 구조를 갖춘 MVP로 실제 사용자 흐름에 따라 시연이 가능합니다.</w:t>
       </w:r>
     </w:p>
     <w:p>
@@ -6141,8 +6507,8 @@
         </w:rPr>
         <w:lastRenderedPageBreak/>
         <w:drawing>
-          <wp:inline distT="0" distB="0" distL="0" distR="0" wp14:anchorId="24260AAD" wp14:editId="2D54323B">
-            <wp:extent cx="3819525" cy="5908222"/>
+          <wp:inline distT="0" distB="0" distL="0" distR="0" wp14:anchorId="24260AAD" wp14:editId="48284DEC">
+            <wp:extent cx="2591522" cy="4008687"/>
             <wp:effectExtent l="0" t="0" r="0" b="0"/>
             <wp:docPr id="1060" name="Picture 1060"/>
             <wp:cNvGraphicFramePr>
@@ -6164,7 +6530,7 @@
                   <pic:spPr>
                     <a:xfrm>
                       <a:off x="0" y="0"/>
-                      <a:ext cx="3826079" cy="5918359"/>
+                      <a:ext cx="2607108" cy="4032796"/>
                     </a:xfrm>
                     <a:prstGeom prst="rect">
                       <a:avLst/>
@@ -6307,27 +6673,7 @@
     <w:p>
       <w:pPr>
         <w:rPr>
-          <w:rFonts w:ascii="맑은 고딕" w:eastAsia="맑은 고딕" w:hAnsi="맑은 고딕" w:cs="맑은 고딕"/>
-          <w:bCs/>
-          <w:sz w:val="20"/>
-          <w:szCs w:val="24"/>
-        </w:rPr>
-      </w:pPr>
-    </w:p>
-    <w:p>
-      <w:pPr>
-        <w:rPr>
-          <w:rFonts w:ascii="맑은 고딕" w:eastAsia="맑은 고딕" w:hAnsi="맑은 고딕" w:cs="맑은 고딕"/>
-          <w:bCs/>
-          <w:sz w:val="20"/>
-          <w:szCs w:val="24"/>
-        </w:rPr>
-      </w:pPr>
-    </w:p>
-    <w:p>
-      <w:pPr>
-        <w:rPr>
-          <w:rFonts w:ascii="맑은 고딕" w:eastAsia="맑은 고딕" w:hAnsi="맑은 고딕" w:cs="맑은 고딕"/>
+          <w:rFonts w:ascii="맑은 고딕" w:eastAsia="맑은 고딕" w:hAnsi="맑은 고딕" w:cs="맑은 고딕" w:hint="eastAsia"/>
           <w:bCs/>
           <w:sz w:val="20"/>
           <w:szCs w:val="24"/>
@@ -6348,7 +6694,6 @@
           <w:noProof/>
           <w:sz w:val="20"/>
         </w:rPr>
-        <w:lastRenderedPageBreak/>
         <mc:AlternateContent>
           <mc:Choice Requires="wpg">
             <w:drawing>
@@ -6848,6 +7193,7 @@
                                 </w:rPr>
                                 <w:t xml:space="preserve"> </w:t>
                               </w:r>
+                              <w:proofErr w:type="gramStart"/>
                               <w:r>
                                 <w:rPr>
                                   <w:rFonts w:ascii="맑은 고딕" w:eastAsia="맑은 고딕" w:hAnsi="맑은 고딕"/>
@@ -6870,6 +7216,7 @@
                                 </w:rPr>
                                 <w:t>하고자</w:t>
                               </w:r>
+                              <w:proofErr w:type="gramEnd"/>
                               <w:r>
                                 <w:rPr>
                                   <w:rFonts w:ascii="맑은 고딕" w:eastAsia="맑은 고딕" w:hAnsi="맑은 고딕"/>
@@ -7539,18 +7886,44 @@
     <w:p>
       <w:pPr>
         <w:rPr>
+          <w:rFonts w:ascii="맑은 고딕" w:eastAsia="맑은 고딕" w:hAnsi="맑은 고딕" w:hint="eastAsia"/>
+          <w:sz w:val="20"/>
+        </w:rPr>
+      </w:pPr>
+    </w:p>
+    <w:p>
+      <w:pPr>
+        <w:rPr>
           <w:rFonts w:ascii="맑은 고딕" w:eastAsia="맑은 고딕" w:hAnsi="맑은 고딕" w:cs="굴림"/>
           <w:color w:val="000000"/>
           <w:sz w:val="20"/>
           <w:szCs w:val="28"/>
         </w:rPr>
       </w:pPr>
+      <w:proofErr w:type="spellStart"/>
       <w:r>
         <w:rPr>
           <w:rFonts w:ascii="맑은 고딕" w:eastAsia="맑은 고딕" w:hAnsi="맑은 고딕"/>
           <w:sz w:val="20"/>
         </w:rPr>
-        <w:t>ㅇ 사업화 추진 전략</w:t>
+        <w:t>ㅇ</w:t>
+      </w:r>
+      <w:proofErr w:type="spellEnd"/>
+      <w:r>
+        <w:rPr>
+          <w:rFonts w:ascii="맑은 고딕" w:eastAsia="맑은 고딕" w:hAnsi="맑은 고딕"/>
+          <w:sz w:val="20"/>
+        </w:rPr>
+        <w:t xml:space="preserve"> </w:t>
+      </w:r>
+      <w:r>
+        <w:rPr>
+          <w:rFonts w:ascii="맑은 고딕" w:eastAsia="맑은 고딕" w:hAnsi="맑은 고딕"/>
+          <w:b/>
+          <w:bCs/>
+          <w:sz w:val="20"/>
+        </w:rPr>
+        <w:t>사업화 추진 전략</w:t>
       </w:r>
     </w:p>
     <w:p>
@@ -7565,7 +7938,15 @@
           <w:rFonts w:ascii="맑은 고딕" w:eastAsia="맑은 고딕" w:hAnsi="맑은 고딕"/>
           <w:sz w:val="20"/>
         </w:rPr>
-        <w:t>초기 목표 고객은 SNS 마케팅 수요는 높지만 내부 인력과 분석 역량이 부족한 외식업 자영업자이며, 지역 단위 PoC로 사용성과 반복 사용 가능성을 먼저 검증합니다. 이후 업종별 수요를 구조화해 상품 설계에 반영합니다.</w:t>
+        <w:t xml:space="preserve">초기 목표 고객은 SNS 마케팅 수요는 높지만 내부 인력과 분석 역량이 부족한 외식업 자영업자이며, 지역 </w:t>
+      </w:r>
+      <w:r>
+        <w:rPr>
+          <w:rFonts w:ascii="맑은 고딕" w:eastAsia="맑은 고딕" w:hAnsi="맑은 고딕"/>
+          <w:sz w:val="20"/>
+        </w:rPr>
+        <w:lastRenderedPageBreak/>
+        <w:t>단위 PoC로 사용성과 반복 사용 가능성을 먼저 검증합니다. 이후 업종별 수요를 구조화해 상품 설계에 반영합니다.</w:t>
       </w:r>
     </w:p>
     <w:p>
@@ -7686,6 +8067,99 @@
           <w:szCs w:val="24"/>
         </w:rPr>
       </w:pPr>
+      <w:r>
+        <w:rPr>
+          <w:rFonts w:ascii="맑은 고딕" w:eastAsia="맑은 고딕" w:hAnsi="맑은 고딕" w:hint="eastAsia"/>
+          <w:sz w:val="20"/>
+          <w:szCs w:val="24"/>
+        </w:rPr>
+        <w:t>비즈니스</w:t>
+      </w:r>
+      <w:r>
+        <w:rPr>
+          <w:rFonts w:ascii="맑은 고딕" w:eastAsia="맑은 고딕" w:hAnsi="맑은 고딕"/>
+          <w:sz w:val="20"/>
+          <w:szCs w:val="24"/>
+        </w:rPr>
+        <w:t xml:space="preserve"> 모델은 무료 체험을 통해 핵심 가치를 빠르게 인식하게 한 뒤, 반복 사용 구간에서 Basic 구독으로 전환시키는 구조입니다. </w:t>
+      </w:r>
+    </w:p>
+    <w:p>
+      <w:pPr>
+        <w:rPr>
+          <w:rFonts w:ascii="맑은 고딕" w:eastAsia="맑은 고딕" w:hAnsi="맑은 고딕"/>
+          <w:sz w:val="20"/>
+          <w:szCs w:val="24"/>
+        </w:rPr>
+      </w:pPr>
+      <w:r>
+        <w:rPr>
+          <w:rFonts w:ascii="맑은 고딕" w:eastAsia="맑은 고딕" w:hAnsi="맑은 고딕"/>
+          <w:sz w:val="20"/>
+          <w:szCs w:val="24"/>
+        </w:rPr>
+        <w:t xml:space="preserve">무료 구간에서는 리뷰 분석과 핵심 인사이트를 경험하게 하고, Basic에서는 반복적인 분석, 콘텐츠 제작, 실행 제안 기능을 월 단위로 제공하여 정기 사용을 유도합니다. </w:t>
+      </w:r>
+    </w:p>
+    <w:p>
+      <w:pPr>
+        <w:rPr>
+          <w:rFonts w:ascii="맑은 고딕" w:eastAsia="맑은 고딕" w:hAnsi="맑은 고딕" w:hint="eastAsia"/>
+          <w:sz w:val="20"/>
+          <w:szCs w:val="24"/>
+        </w:rPr>
+      </w:pPr>
+      <w:r>
+        <w:rPr>
+          <w:rFonts w:ascii="맑은 고딕" w:eastAsia="맑은 고딕" w:hAnsi="맑은 고딕"/>
+          <w:sz w:val="20"/>
+          <w:szCs w:val="24"/>
+        </w:rPr>
+        <w:t xml:space="preserve">이후 Pro 단계에서는 리뷰 운영 고도화, 고급 리포트, </w:t>
+      </w:r>
+      <w:proofErr w:type="spellStart"/>
+      <w:r>
+        <w:rPr>
+          <w:rFonts w:ascii="맑은 고딕" w:eastAsia="맑은 고딕" w:hAnsi="맑은 고딕"/>
+          <w:sz w:val="20"/>
+          <w:szCs w:val="24"/>
+        </w:rPr>
+        <w:t>다점포</w:t>
+      </w:r>
+      <w:proofErr w:type="spellEnd"/>
+      <w:r>
+        <w:rPr>
+          <w:rFonts w:ascii="맑은 고딕" w:eastAsia="맑은 고딕" w:hAnsi="맑은 고딕"/>
+          <w:sz w:val="20"/>
+          <w:szCs w:val="24"/>
+        </w:rPr>
+        <w:t xml:space="preserve"> 관리 또는 제휴형 기능을 추가하여 객단가와 유지율을 함께 높이고, 장기적으로는 구독 매출 </w:t>
+      </w:r>
+      <w:r>
+        <w:rPr>
+          <w:rFonts w:ascii="맑은 고딕" w:eastAsia="맑은 고딕" w:hAnsi="맑은 고딕" w:hint="eastAsia"/>
+          <w:sz w:val="20"/>
+          <w:szCs w:val="24"/>
+        </w:rPr>
+        <w:t>외</w:t>
+      </w:r>
+      <w:r>
+        <w:rPr>
+          <w:rFonts w:ascii="맑은 고딕" w:eastAsia="맑은 고딕" w:hAnsi="맑은 고딕"/>
+          <w:sz w:val="20"/>
+          <w:szCs w:val="24"/>
+        </w:rPr>
+        <w:t xml:space="preserve"> 확장 수익모델로 연결할 계획입니다.</w:t>
+      </w:r>
+    </w:p>
+    <w:p>
+      <w:pPr>
+        <w:rPr>
+          <w:rFonts w:ascii="맑은 고딕" w:eastAsia="맑은 고딕" w:hAnsi="맑은 고딕"/>
+          <w:sz w:val="20"/>
+          <w:szCs w:val="24"/>
+        </w:rPr>
+      </w:pPr>
     </w:p>
     <w:bookmarkEnd w:id="0"/>
     <w:p>
@@ -7699,6 +8173,7 @@
           <w:szCs w:val="26"/>
         </w:rPr>
       </w:pPr>
+      <w:proofErr w:type="gramStart"/>
       <w:r>
         <w:rPr>
           <w:rFonts w:ascii="맑은 고딕" w:eastAsia="맑은 고딕" w:hAnsi="맑은 고딕"/>
@@ -7724,6 +8199,7 @@
         </w:rPr>
         <w:t>사업추진</w:t>
       </w:r>
+      <w:proofErr w:type="gramEnd"/>
       <w:r>
         <w:rPr>
           <w:rFonts w:ascii="맑은 고딕" w:eastAsia="맑은 고딕" w:hAnsi="맑은 고딕"/>
@@ -7756,7 +8232,16 @@
           <w:sz w:val="20"/>
           <w:szCs w:val="26"/>
         </w:rPr>
-        <w:t>내)</w:t>
+        <w:t>내</w:t>
+      </w:r>
+      <w:proofErr w:type="gramStart"/>
+      <w:r>
+        <w:rPr>
+          <w:rFonts w:ascii="맑은 고딕" w:eastAsia="맑은 고딕" w:hAnsi="맑은 고딕"/>
+          <w:sz w:val="20"/>
+          <w:szCs w:val="26"/>
+        </w:rPr>
+        <w:t>)</w:t>
       </w:r>
       <w:r>
         <w:rPr>
@@ -7776,6 +8261,7 @@
         </w:rPr>
         <w:t>&gt;</w:t>
       </w:r>
+      <w:proofErr w:type="gramEnd"/>
     </w:p>
     <w:p>
       <w:pPr>
@@ -8408,6 +8894,7 @@
           <w:szCs w:val="26"/>
         </w:rPr>
       </w:pPr>
+      <w:proofErr w:type="gramStart"/>
       <w:r>
         <w:rPr>
           <w:rFonts w:ascii="맑은 고딕" w:eastAsia="맑은 고딕" w:hAnsi="맑은 고딕"/>
@@ -8425,6 +8912,7 @@
         </w:rPr>
         <w:t xml:space="preserve"> 1</w:t>
       </w:r>
+      <w:proofErr w:type="gramEnd"/>
       <w:r>
         <w:rPr>
           <w:rFonts w:ascii="맑은 고딕" w:eastAsia="맑은 고딕" w:hAnsi="맑은 고딕" w:hint="eastAsia"/>
@@ -8451,6 +8939,7 @@
         </w:rPr>
         <w:t xml:space="preserve"> </w:t>
       </w:r>
+      <w:proofErr w:type="gramStart"/>
       <w:r>
         <w:rPr>
           <w:rFonts w:ascii="맑은 고딕" w:eastAsia="맑은 고딕" w:hAnsi="맑은 고딕"/>
@@ -8477,6 +8966,7 @@
         </w:rPr>
         <w:t>&gt;</w:t>
       </w:r>
+      <w:proofErr w:type="gramEnd"/>
     </w:p>
     <w:p>
       <w:pPr>
@@ -9352,6 +9842,7 @@
           <w:szCs w:val="26"/>
         </w:rPr>
       </w:pPr>
+      <w:proofErr w:type="gramStart"/>
       <w:r>
         <w:rPr>
           <w:rFonts w:ascii="맑은 고딕" w:eastAsia="맑은 고딕" w:hAnsi="맑은 고딕"/>
@@ -9369,6 +9860,7 @@
         </w:rPr>
         <w:t xml:space="preserve"> 2</w:t>
       </w:r>
+      <w:proofErr w:type="gramEnd"/>
       <w:r>
         <w:rPr>
           <w:rFonts w:ascii="맑은 고딕" w:eastAsia="맑은 고딕" w:hAnsi="맑은 고딕" w:hint="eastAsia"/>
@@ -9395,6 +9887,7 @@
         </w:rPr>
         <w:t xml:space="preserve"> </w:t>
       </w:r>
+      <w:proofErr w:type="gramStart"/>
       <w:r>
         <w:rPr>
           <w:rFonts w:ascii="맑은 고딕" w:eastAsia="맑은 고딕" w:hAnsi="맑은 고딕"/>
@@ -9421,6 +9914,7 @@
         </w:rPr>
         <w:t>&gt;</w:t>
       </w:r>
+      <w:proofErr w:type="gramEnd"/>
     </w:p>
     <w:p>
       <w:pPr>
@@ -10893,6 +11387,7 @@
                                   <w:rFonts w:ascii="맑은 고딕" w:eastAsia="맑은 고딕"/>
                                 </w:rPr>
                               </w:pPr>
+                              <w:proofErr w:type="gramStart"/>
                               <w:r>
                                 <w:rPr>
                                   <w:rFonts w:ascii="맑은 고딕" w:eastAsia="맑은 고딕"/>
@@ -10915,6 +11410,7 @@
                                 </w:rPr>
                                 <w:t>:</w:t>
                               </w:r>
+                              <w:proofErr w:type="gramEnd"/>
                               <w:r>
                                 <w:rPr>
                                   <w:rFonts w:ascii="맑은 고딕" w:eastAsia="맑은 고딕"/>
@@ -11126,6 +11622,7 @@
                                   <w:rFonts w:ascii="맑은 고딕" w:eastAsia="맑은 고딕"/>
                                 </w:rPr>
                               </w:pPr>
+                              <w:proofErr w:type="gramStart"/>
                               <w:r>
                                 <w:rPr>
                                   <w:rFonts w:ascii="맑은 고딕" w:eastAsia="맑은 고딕"/>
@@ -11148,6 +11645,7 @@
                                 </w:rPr>
                                 <w:t>:</w:t>
                               </w:r>
+                              <w:proofErr w:type="gramEnd"/>
                               <w:r>
                                 <w:rPr>
                                   <w:rFonts w:ascii="맑은 고딕" w:eastAsia="맑은 고딕"/>
@@ -11344,6 +11842,7 @@
                                   <w:rFonts w:ascii="맑은 고딕" w:eastAsia="맑은 고딕"/>
                                 </w:rPr>
                               </w:pPr>
+                              <w:proofErr w:type="gramStart"/>
                               <w:r>
                                 <w:rPr>
                                   <w:rFonts w:ascii="맑은 고딕" w:eastAsia="맑은 고딕"/>
@@ -11366,6 +11865,7 @@
                                 </w:rPr>
                                 <w:t>:</w:t>
                               </w:r>
+                              <w:proofErr w:type="gramEnd"/>
                               <w:r>
                                 <w:rPr>
                                   <w:rFonts w:ascii="맑은 고딕" w:eastAsia="맑은 고딕"/>
@@ -12489,12 +12989,30 @@
           <w:szCs w:val="28"/>
         </w:rPr>
       </w:pPr>
+      <w:proofErr w:type="spellStart"/>
       <w:r>
         <w:rPr>
           <w:rFonts w:ascii="맑은 고딕" w:eastAsia="맑은 고딕" w:hAnsi="맑은 고딕"/>
           <w:sz w:val="20"/>
         </w:rPr>
-        <w:t>ㅇ 경쟁사 분석 및 목표시장 진입 전략</w:t>
+        <w:t>ㅇ</w:t>
+      </w:r>
+      <w:proofErr w:type="spellEnd"/>
+      <w:r>
+        <w:rPr>
+          <w:rFonts w:ascii="맑은 고딕" w:eastAsia="맑은 고딕" w:hAnsi="맑은 고딕"/>
+          <w:sz w:val="20"/>
+        </w:rPr>
+        <w:t xml:space="preserve"> </w:t>
+      </w:r>
+      <w:r>
+        <w:rPr>
+          <w:rFonts w:ascii="맑은 고딕" w:eastAsia="맑은 고딕" w:hAnsi="맑은 고딕"/>
+          <w:b/>
+          <w:bCs/>
+          <w:sz w:val="20"/>
+        </w:rPr>
+        <w:t>경쟁사 분석 및 목표시장 진입 전략</w:t>
       </w:r>
     </w:p>
     <w:p>
@@ -12509,20 +13027,14 @@
           <w:rFonts w:ascii="맑은 고딕" w:eastAsia="맑은 고딕" w:hAnsi="맑은 고딕"/>
           <w:sz w:val="20"/>
         </w:rPr>
-        <w:t>기존 디자인·영상 툴은 제작 중심이고, 광고 플랫폼은 집행 중심입니다. PULSE는 회원가입 직후 분석 시작, 리뷰 기반 고객 이해, 실행 제안형 대시보드까지 이어지는 운영 루프를 제공해 경쟁 서비스 대비 실행 연결성이 높습니다.</w:t>
+        <w:t xml:space="preserve">기존 디자인·영상 툴은 제작 중심이고, 광고 플랫폼은 집행 중심입니다. </w:t>
       </w:r>
     </w:p>
     <w:p>
       <w:pPr>
-        <w:pStyle w:val="a4"/>
-        <w:numPr>
-          <w:ilvl w:val="0"/>
-          <w:numId w:val="4"/>
-        </w:numPr>
         <w:rPr>
           <w:rFonts w:ascii="맑은 고딕" w:eastAsia="맑은 고딕" w:hAnsi="맑은 고딕"/>
           <w:sz w:val="20"/>
-          <w:szCs w:val="24"/>
         </w:rPr>
       </w:pPr>
       <w:r>
@@ -12530,7 +13042,14 @@
           <w:rFonts w:ascii="맑은 고딕" w:eastAsia="맑은 고딕" w:hAnsi="맑은 고딕"/>
           <w:sz w:val="20"/>
         </w:rPr>
-        <w:t>초기에는 MVP 시연과 파일럿 운영으로 레퍼런스를 확보하고, 이후 구독형 전환과 Pro 기능 확장으로 시장에 진입합니다.</w:t>
+        <w:t>PULSE는 회원가입 직후 분석 시작, 리뷰 기반 고객 이해, 실행 제안형 대시보드까지 이어지는 운영 루프를 제공해 경쟁 서비스 대비 실행 연결성이 높습니다.</w:t>
+      </w:r>
+      <w:r>
+        <w:rPr>
+          <w:rFonts w:ascii="맑은 고딕" w:eastAsia="맑은 고딕" w:hAnsi="맑은 고딕" w:hint="eastAsia"/>
+          <w:sz w:val="20"/>
+        </w:rPr>
+        <w:t xml:space="preserve"> </w:t>
       </w:r>
     </w:p>
     <w:p>
@@ -12538,30 +13057,131 @@
         <w:rPr>
           <w:rFonts w:ascii="맑은 고딕" w:eastAsia="맑은 고딕" w:hAnsi="맑은 고딕"/>
           <w:sz w:val="20"/>
+          <w:szCs w:val="24"/>
+        </w:rPr>
+      </w:pPr>
+      <w:r>
+        <w:rPr>
+          <w:rFonts w:ascii="맑은 고딕" w:eastAsia="맑은 고딕" w:hAnsi="맑은 고딕"/>
+          <w:sz w:val="20"/>
+          <w:szCs w:val="24"/>
+        </w:rPr>
+        <w:t xml:space="preserve">PULSE의 시장 진입 전략은 분석만 제공하는 도구와 제작만 지원하는 도구 사이의 공백을 공략하는 것입니다. </w:t>
+      </w:r>
+    </w:p>
+    <w:p>
+      <w:pPr>
+        <w:rPr>
+          <w:rFonts w:ascii="맑은 고딕" w:eastAsia="맑은 고딕" w:hAnsi="맑은 고딕"/>
+          <w:sz w:val="20"/>
+          <w:szCs w:val="24"/>
+        </w:rPr>
+      </w:pPr>
+      <w:r>
+        <w:rPr>
+          <w:rFonts w:ascii="맑은 고딕" w:eastAsia="맑은 고딕" w:hAnsi="맑은 고딕"/>
+          <w:sz w:val="20"/>
+          <w:szCs w:val="24"/>
+        </w:rPr>
+        <w:t xml:space="preserve">초기에는 MVP 시연과 파일럿 운영을 통해 실제 외식업 현장에서의 활용 사례를 확보하고, 이를 레퍼런스로 삼아 유사 업종과 인접 지역 점포로 확산할 계획입니다. </w:t>
+      </w:r>
+    </w:p>
+    <w:p>
+      <w:pPr>
+        <w:rPr>
+          <w:rFonts w:ascii="맑은 고딕" w:eastAsia="맑은 고딕" w:hAnsi="맑은 고딕"/>
+          <w:sz w:val="20"/>
+        </w:rPr>
+      </w:pPr>
+      <w:r>
+        <w:rPr>
+          <w:rFonts w:ascii="맑은 고딕" w:eastAsia="맑은 고딕" w:hAnsi="맑은 고딕"/>
+          <w:sz w:val="20"/>
+          <w:szCs w:val="24"/>
+        </w:rPr>
+        <w:t>특히 외식업 자영업자가 가장 부담을 느끼는 고객 해석, 콘텐츠 기획, 실행 판단의 시간을 하나의 서비스 흐름으로 줄여준다는 점을 전면에 내세워, 단순 제작 툴이 아니라 실행까지 연결하는 운</w:t>
+      </w:r>
+      <w:r>
+        <w:rPr>
+          <w:rFonts w:ascii="맑은 고딕" w:eastAsia="맑은 고딕" w:hAnsi="맑은 고딕" w:hint="eastAsia"/>
+          <w:sz w:val="20"/>
+          <w:szCs w:val="24"/>
+        </w:rPr>
+        <w:t>영형</w:t>
+      </w:r>
+      <w:r>
+        <w:rPr>
+          <w:rFonts w:ascii="맑은 고딕" w:eastAsia="맑은 고딕" w:hAnsi="맑은 고딕"/>
+          <w:sz w:val="20"/>
+          <w:szCs w:val="24"/>
+        </w:rPr>
+        <w:t xml:space="preserve"> SaaS로 포지셔닝</w:t>
+      </w:r>
+      <w:r>
+        <w:rPr>
+          <w:rFonts w:ascii="맑은 고딕" w:eastAsia="맑은 고딕" w:hAnsi="맑은 고딕" w:hint="eastAsia"/>
+          <w:sz w:val="20"/>
+          <w:szCs w:val="24"/>
+        </w:rPr>
+        <w:t xml:space="preserve"> </w:t>
+      </w:r>
+      <w:r>
+        <w:rPr>
+          <w:rFonts w:ascii="맑은 고딕" w:eastAsia="맑은 고딕" w:hAnsi="맑은 고딕"/>
+          <w:sz w:val="20"/>
+          <w:szCs w:val="24"/>
+        </w:rPr>
+        <w:t>하겠습니다.</w:t>
+      </w:r>
+    </w:p>
+    <w:p>
+      <w:pPr>
+        <w:rPr>
+          <w:rFonts w:ascii="맑은 고딕" w:eastAsia="맑은 고딕" w:hAnsi="맑은 고딕"/>
+          <w:sz w:val="20"/>
         </w:rPr>
       </w:pPr>
     </w:p>
     <w:p>
       <w:pPr>
-        <w:pStyle w:val="a4"/>
-        <w:numPr>
-          <w:ilvl w:val="0"/>
-          <w:numId w:val="4"/>
-        </w:numPr>
-        <w:rPr>
-          <w:rFonts w:ascii="맑은 고딕" w:eastAsia="맑은 고딕" w:hAnsi="맑은 고딕"/>
-          <w:sz w:val="20"/>
-          <w:szCs w:val="24"/>
+        <w:rPr>
+          <w:rFonts w:ascii="맑은 고딕" w:eastAsia="맑은 고딕" w:hAnsi="맑은 고딕" w:hint="eastAsia"/>
+          <w:sz w:val="20"/>
         </w:rPr>
       </w:pPr>
     </w:p>
     <w:p>
       <w:pPr>
         <w:rPr>
+          <w:rFonts w:ascii="맑은 고딕" w:eastAsia="맑은 고딕" w:hAnsi="맑은 고딕" w:hint="eastAsia"/>
+          <w:sz w:val="20"/>
+        </w:rPr>
+      </w:pPr>
+      <w:proofErr w:type="spellStart"/>
+      <w:r>
+        <w:rPr>
           <w:rFonts w:ascii="맑은 고딕" w:eastAsia="맑은 고딕" w:hAnsi="맑은 고딕"/>
           <w:sz w:val="20"/>
         </w:rPr>
-      </w:pPr>
+        <w:t>ㅇ</w:t>
+      </w:r>
+      <w:proofErr w:type="spellEnd"/>
+      <w:r>
+        <w:rPr>
+          <w:rFonts w:ascii="맑은 고딕" w:eastAsia="맑은 고딕" w:hAnsi="맑은 고딕" w:hint="eastAsia"/>
+          <w:sz w:val="20"/>
+        </w:rPr>
+        <w:t xml:space="preserve"> </w:t>
+      </w:r>
+      <w:r>
+        <w:rPr>
+          <w:rFonts w:ascii="맑은 고딕" w:eastAsia="맑은 고딕" w:hAnsi="맑은 고딕" w:hint="eastAsia"/>
+          <w:b/>
+          <w:bCs/>
+          <w:sz w:val="20"/>
+        </w:rPr>
+        <w:t>외식업자를 위한 PULSE만의 특별한 점</w:t>
+      </w:r>
     </w:p>
     <w:p>
       <w:pPr>
@@ -12609,21 +13229,141 @@
     </w:p>
     <w:p>
       <w:pPr>
-        <w:pStyle w:val="a4"/>
-        <w:numPr>
-          <w:ilvl w:val="0"/>
-          <w:numId w:val="4"/>
-        </w:numPr>
-        <w:rPr>
-          <w:rFonts w:ascii="맑은 고딕" w:eastAsia="맑은 고딕" w:hAnsi="맑은 고딕"/>
-          <w:sz w:val="20"/>
-          <w:szCs w:val="24"/>
+        <w:rPr>
+          <w:rFonts w:ascii="맑은 고딕" w:eastAsia="맑은 고딕" w:hAnsi="맑은 고딕" w:hint="eastAsia"/>
+          <w:sz w:val="20"/>
         </w:rPr>
       </w:pPr>
     </w:p>
     <w:p>
       <w:pPr>
         <w:rPr>
+          <w:rFonts w:ascii="맑은 고딕" w:eastAsia="맑은 고딕" w:hAnsi="맑은 고딕" w:hint="eastAsia"/>
+          <w:sz w:val="20"/>
+        </w:rPr>
+      </w:pPr>
+      <w:proofErr w:type="spellStart"/>
+      <w:r>
+        <w:rPr>
+          <w:rFonts w:ascii="맑은 고딕" w:eastAsia="맑은 고딕" w:hAnsi="맑은 고딕"/>
+          <w:sz w:val="20"/>
+        </w:rPr>
+        <w:t>ㅇ</w:t>
+      </w:r>
+      <w:proofErr w:type="spellEnd"/>
+      <w:r>
+        <w:rPr>
+          <w:rFonts w:ascii="맑은 고딕" w:eastAsia="맑은 고딕" w:hAnsi="맑은 고딕" w:hint="eastAsia"/>
+          <w:sz w:val="20"/>
+        </w:rPr>
+        <w:t xml:space="preserve"> </w:t>
+      </w:r>
+      <w:r>
+        <w:rPr>
+          <w:rFonts w:ascii="맑은 고딕" w:eastAsia="맑은 고딕" w:hAnsi="맑은 고딕" w:hint="eastAsia"/>
+          <w:b/>
+          <w:bCs/>
+          <w:sz w:val="20"/>
+        </w:rPr>
+        <w:t>PULSE의 Pain Point 및 성장 방향성</w:t>
+      </w:r>
+    </w:p>
+    <w:p>
+      <w:pPr>
+        <w:rPr>
+          <w:rFonts w:ascii="맑은 고딕" w:eastAsia="맑은 고딕" w:hAnsi="맑은 고딕"/>
+          <w:sz w:val="20"/>
+          <w:szCs w:val="24"/>
+        </w:rPr>
+      </w:pPr>
+      <w:r>
+        <w:rPr>
+          <w:rFonts w:ascii="맑은 고딕" w:eastAsia="맑은 고딕" w:hAnsi="맑은 고딕" w:hint="eastAsia"/>
+          <w:sz w:val="20"/>
+          <w:szCs w:val="24"/>
+        </w:rPr>
+        <w:t>초기</w:t>
+      </w:r>
+      <w:r>
+        <w:rPr>
+          <w:rFonts w:ascii="맑은 고딕" w:eastAsia="맑은 고딕" w:hAnsi="맑은 고딕"/>
+          <w:sz w:val="20"/>
+          <w:szCs w:val="24"/>
+        </w:rPr>
+        <w:t xml:space="preserve"> 사업화는 온라인 리뷰가 누적되어 있으나 이를 해석하고 마케팅 행동으로 연결할 내부 인력과 시간이 부족한 외식업 자영업자를 핵심 고객으로 설정하고 추진할 계획입니다.</w:t>
+      </w:r>
+    </w:p>
+    <w:p>
+      <w:pPr>
+        <w:rPr>
+          <w:rFonts w:ascii="맑은 고딕" w:eastAsia="맑은 고딕" w:hAnsi="맑은 고딕"/>
+          <w:sz w:val="20"/>
+          <w:szCs w:val="24"/>
+        </w:rPr>
+      </w:pPr>
+      <w:r>
+        <w:rPr>
+          <w:rFonts w:ascii="맑은 고딕" w:eastAsia="맑은 고딕" w:hAnsi="맑은 고딕"/>
+          <w:sz w:val="20"/>
+          <w:szCs w:val="24"/>
+        </w:rPr>
+        <w:t>협약기간에는 지역 단위 PoC를 통해 실제 점포 운영 환경에서 서비스 사용 빈도, 콘텐츠 재생성 여부, 실행 제안 반영 여부를 검증하고, 확보한 사용 데이터를 바탕으로 업종별로 필요한 분석 항목과 실행 기능의 우선순위를 정교화</w:t>
+      </w:r>
+      <w:r>
+        <w:rPr>
+          <w:rFonts w:ascii="맑은 고딕" w:eastAsia="맑은 고딕" w:hAnsi="맑은 고딕" w:hint="eastAsia"/>
+          <w:sz w:val="20"/>
+          <w:szCs w:val="24"/>
+        </w:rPr>
+        <w:t xml:space="preserve"> </w:t>
+      </w:r>
+      <w:r>
+        <w:rPr>
+          <w:rFonts w:ascii="맑은 고딕" w:eastAsia="맑은 고딕" w:hAnsi="맑은 고딕"/>
+          <w:sz w:val="20"/>
+          <w:szCs w:val="24"/>
+        </w:rPr>
+        <w:t xml:space="preserve">하겠습니다. </w:t>
+      </w:r>
+    </w:p>
+    <w:p>
+      <w:pPr>
+        <w:rPr>
+          <w:rFonts w:ascii="맑은 고딕" w:eastAsia="맑은 고딕" w:hAnsi="맑은 고딕"/>
+          <w:sz w:val="20"/>
+          <w:szCs w:val="24"/>
+        </w:rPr>
+      </w:pPr>
+      <w:r>
+        <w:rPr>
+          <w:rFonts w:ascii="맑은 고딕" w:eastAsia="맑은 고딕" w:hAnsi="맑은 고딕"/>
+          <w:sz w:val="20"/>
+          <w:szCs w:val="24"/>
+        </w:rPr>
+        <w:t xml:space="preserve">이를 통해 초기에는 단일 점포 중심으로 도입 장벽을 낮추고, 이후 </w:t>
+      </w:r>
+      <w:proofErr w:type="spellStart"/>
+      <w:r>
+        <w:rPr>
+          <w:rFonts w:ascii="맑은 고딕" w:eastAsia="맑은 고딕" w:hAnsi="맑은 고딕"/>
+          <w:sz w:val="20"/>
+          <w:szCs w:val="24"/>
+        </w:rPr>
+        <w:t>다점포</w:t>
+      </w:r>
+      <w:proofErr w:type="spellEnd"/>
+      <w:r>
+        <w:rPr>
+          <w:rFonts w:ascii="맑은 고딕" w:eastAsia="맑은 고딕" w:hAnsi="맑은 고딕"/>
+          <w:sz w:val="20"/>
+          <w:szCs w:val="24"/>
+        </w:rPr>
+        <w:t xml:space="preserve"> 운영 수요와 업종별 운영 특성을 반영한 확장형 상품으로 단계적으로 확대하겠습니다.</w:t>
+      </w:r>
+    </w:p>
+    <w:p>
+      <w:pPr>
+        <w:rPr>
           <w:rFonts w:ascii="맑은 고딕" w:eastAsia="맑은 고딕" w:hAnsi="맑은 고딕"/>
           <w:sz w:val="20"/>
           <w:szCs w:val="24"/>
@@ -12656,91 +13396,27 @@
           <w:szCs w:val="24"/>
         </w:rPr>
       </w:pPr>
+      <w:r>
+        <w:rPr>
+          <w:rFonts w:ascii="맑은 고딕" w:eastAsia="맑은 고딕" w:hAnsi="맑은 고딕" w:hint="eastAsia"/>
+          <w:sz w:val="20"/>
+          <w:szCs w:val="24"/>
+        </w:rPr>
+        <w:t>핵심</w:t>
+      </w:r>
+      <w:r>
+        <w:rPr>
+          <w:rFonts w:ascii="맑은 고딕" w:eastAsia="맑은 고딕" w:hAnsi="맑은 고딕"/>
+          <w:sz w:val="20"/>
+          <w:szCs w:val="24"/>
+        </w:rPr>
+        <w:t xml:space="preserve"> 검증 항목은 실제 점포의 재사용 여부, 기능 활용 빈도, 실행 제안 반영 가능성, 유료 전환 의향입니다.</w:t>
+      </w:r>
     </w:p>
     <w:p>
       <w:pPr>
         <w:rPr>
-          <w:rFonts w:ascii="맑은 고딕" w:eastAsia="맑은 고딕" w:hAnsi="맑은 고딕"/>
-          <w:sz w:val="20"/>
-          <w:szCs w:val="24"/>
-        </w:rPr>
-      </w:pPr>
-    </w:p>
-    <w:p>
-      <w:pPr>
-        <w:rPr>
-          <w:rFonts w:ascii="맑은 고딕" w:eastAsia="맑은 고딕" w:hAnsi="맑은 고딕"/>
-          <w:sz w:val="20"/>
-          <w:szCs w:val="24"/>
-        </w:rPr>
-      </w:pPr>
-    </w:p>
-    <w:p>
-      <w:pPr>
-        <w:rPr>
-          <w:rFonts w:ascii="맑은 고딕" w:eastAsia="맑은 고딕" w:hAnsi="맑은 고딕"/>
-          <w:sz w:val="20"/>
-          <w:szCs w:val="24"/>
-        </w:rPr>
-      </w:pPr>
-    </w:p>
-    <w:p>
-      <w:pPr>
-        <w:rPr>
-          <w:rFonts w:ascii="맑은 고딕" w:eastAsia="맑은 고딕" w:hAnsi="맑은 고딕"/>
-          <w:sz w:val="20"/>
-          <w:szCs w:val="24"/>
-        </w:rPr>
-      </w:pPr>
-    </w:p>
-    <w:p>
-      <w:pPr>
-        <w:rPr>
-          <w:rFonts w:ascii="맑은 고딕" w:eastAsia="맑은 고딕" w:hAnsi="맑은 고딕"/>
-          <w:sz w:val="20"/>
-          <w:szCs w:val="24"/>
-        </w:rPr>
-      </w:pPr>
-    </w:p>
-    <w:p>
-      <w:pPr>
-        <w:pStyle w:val="a3"/>
-        <w:spacing w:before="11"/>
-        <w:rPr>
-          <w:b w:val="0"/>
-          <w:sz w:val="20"/>
-          <w:szCs w:val="24"/>
-        </w:rPr>
-      </w:pPr>
-    </w:p>
-    <w:p>
-      <w:pPr>
-        <w:pStyle w:val="a3"/>
-        <w:spacing w:before="11"/>
-        <w:rPr>
-          <w:b w:val="0"/>
-          <w:sz w:val="20"/>
-          <w:szCs w:val="24"/>
-        </w:rPr>
-      </w:pPr>
-    </w:p>
-    <w:p>
-      <w:pPr>
-        <w:pStyle w:val="a3"/>
-        <w:spacing w:before="11"/>
-        <w:rPr>
-          <w:b w:val="0"/>
-          <w:sz w:val="20"/>
-          <w:szCs w:val="24"/>
-        </w:rPr>
-      </w:pPr>
-    </w:p>
-    <w:p>
-      <w:pPr>
-        <w:pStyle w:val="a3"/>
-        <w:spacing w:before="11"/>
-        <w:rPr>
-          <w:b w:val="0"/>
+          <w:rFonts w:ascii="맑은 고딕" w:eastAsia="맑은 고딕" w:hAnsi="맑은 고딕" w:hint="eastAsia"/>
           <w:sz w:val="20"/>
           <w:szCs w:val="24"/>
         </w:rPr>
@@ -12752,18 +13428,18 @@
         <w:ind w:right="2908"/>
         <w:jc w:val="right"/>
         <w:rPr>
+          <w:rFonts w:ascii="맑은 고딕" w:eastAsia="맑은 고딕" w:hAnsi="맑은 고딕" w:hint="eastAsia"/>
+          <w:sz w:val="20"/>
+          <w:szCs w:val="26"/>
+        </w:rPr>
+      </w:pPr>
+      <w:proofErr w:type="gramStart"/>
+      <w:r>
+        <w:rPr>
           <w:rFonts w:ascii="맑은 고딕" w:eastAsia="맑은 고딕" w:hAnsi="맑은 고딕"/>
           <w:sz w:val="20"/>
           <w:szCs w:val="26"/>
         </w:rPr>
-      </w:pPr>
-      <w:r>
-        <w:rPr>
-          <w:rFonts w:ascii="맑은 고딕" w:eastAsia="맑은 고딕" w:hAnsi="맑은 고딕"/>
-          <w:sz w:val="20"/>
-          <w:szCs w:val="26"/>
-        </w:rPr>
-        <w:lastRenderedPageBreak/>
         <w:t>&lt;</w:t>
       </w:r>
       <w:r>
@@ -12783,6 +13459,7 @@
         </w:rPr>
         <w:t>사업추진</w:t>
       </w:r>
+      <w:proofErr w:type="gramEnd"/>
       <w:r>
         <w:rPr>
           <w:rFonts w:ascii="맑은 고딕" w:eastAsia="맑은 고딕" w:hAnsi="맑은 고딕"/>
@@ -12820,7 +13497,15 @@
           <w:rFonts w:ascii="맑은 고딕" w:eastAsia="맑은 고딕" w:hAnsi="맑은 고딕"/>
           <w:sz w:val="20"/>
         </w:rPr>
-        <w:t>사업단계)</w:t>
+        <w:t>사업단계</w:t>
+      </w:r>
+      <w:proofErr w:type="gramStart"/>
+      <w:r>
+        <w:rPr>
+          <w:rFonts w:ascii="맑은 고딕" w:eastAsia="맑은 고딕" w:hAnsi="맑은 고딕"/>
+          <w:sz w:val="20"/>
+        </w:rPr>
+        <w:t>)</w:t>
       </w:r>
       <w:r>
         <w:rPr>
@@ -12840,16 +13525,7 @@
         </w:rPr>
         <w:t>&gt;</w:t>
       </w:r>
-    </w:p>
-    <w:p>
-      <w:pPr>
-        <w:pStyle w:val="a3"/>
-        <w:spacing w:before="2"/>
-        <w:rPr>
-          <w:b w:val="0"/>
-          <w:sz w:val="20"/>
-        </w:rPr>
-      </w:pPr>
+      <w:proofErr w:type="gramEnd"/>
     </w:p>
     <w:tbl>
       <w:tblPr>
@@ -13838,7 +14514,23 @@
           <w:color w:val="FF0000"/>
           <w:sz w:val="20"/>
         </w:rPr>
-        <w:t>※ 성명, 성별, 생년월일, 출신학교, 소재지 등의 개인정보(유추가능한 정보)는 삭제 또는 마스킹 [학력] (전문)학·석·박사, 학과·전공</w:t>
+        <w:t xml:space="preserve">※ 성명, 성별, 생년월일, 출신학교, 소재지 등의 개인정보(유추가능한 정보)는 삭제 또는 </w:t>
+      </w:r>
+      <w:proofErr w:type="spellStart"/>
+      <w:r>
+        <w:rPr>
+          <w:color w:val="FF0000"/>
+          <w:sz w:val="20"/>
+        </w:rPr>
+        <w:t>마스킹</w:t>
+      </w:r>
+      <w:proofErr w:type="spellEnd"/>
+      <w:r>
+        <w:rPr>
+          <w:color w:val="FF0000"/>
+          <w:sz w:val="20"/>
+        </w:rPr>
+        <w:t xml:space="preserve"> [학력] (전문)학·석·박사, 학과·전공</w:t>
       </w:r>
       <w:r>
         <w:rPr>
@@ -14204,6 +14896,7 @@
                                   <w:rFonts w:ascii="맑은 고딕" w:eastAsia="맑은 고딕"/>
                                 </w:rPr>
                               </w:pPr>
+                              <w:proofErr w:type="gramStart"/>
                               <w:r>
                                 <w:rPr>
                                   <w:rFonts w:ascii="맑은 고딕" w:eastAsia="맑은 고딕"/>
@@ -14226,6 +14919,7 @@
                                 </w:rPr>
                                 <w:t>:</w:t>
                               </w:r>
+                              <w:proofErr w:type="gramEnd"/>
                               <w:r>
                                 <w:rPr>
                                   <w:rFonts w:ascii="맑은 고딕" w:eastAsia="맑은 고딕"/>
@@ -16239,12 +16933,30 @@
           <w:szCs w:val="28"/>
         </w:rPr>
       </w:pPr>
+      <w:proofErr w:type="spellStart"/>
       <w:r>
         <w:rPr>
           <w:rFonts w:ascii="맑은 고딕" w:eastAsia="맑은 고딕" w:hAnsi="맑은 고딕"/>
           <w:sz w:val="20"/>
         </w:rPr>
-        <w:t>ㅇ 대표자 및 팀원 보유 역량</w:t>
+        <w:t>ㅇ</w:t>
+      </w:r>
+      <w:proofErr w:type="spellEnd"/>
+      <w:r>
+        <w:rPr>
+          <w:rFonts w:ascii="맑은 고딕" w:eastAsia="맑은 고딕" w:hAnsi="맑은 고딕"/>
+          <w:sz w:val="20"/>
+        </w:rPr>
+        <w:t xml:space="preserve"> </w:t>
+      </w:r>
+      <w:r>
+        <w:rPr>
+          <w:rFonts w:ascii="맑은 고딕" w:eastAsia="맑은 고딕" w:hAnsi="맑은 고딕"/>
+          <w:b/>
+          <w:bCs/>
+          <w:sz w:val="20"/>
+        </w:rPr>
+        <w:t>대표자 및 팀원 보유 역량</w:t>
       </w:r>
     </w:p>
     <w:p>
@@ -16259,14 +16971,7 @@
           <w:rFonts w:ascii="맑은 고딕" w:eastAsia="맑은 고딕" w:hAnsi="맑은 고딕"/>
           <w:sz w:val="20"/>
         </w:rPr>
-        <w:t>윤*하</w:t>
-      </w:r>
-      <w:r>
-        <w:rPr>
-          <w:rFonts w:ascii="맑은 고딕" w:eastAsia="맑은 고딕" w:hAnsi="맑은 고딕"/>
-          <w:sz w:val="20"/>
-        </w:rPr>
-        <w:t xml:space="preserve"> 대표자는 외식업 자영업자의 문제를 서비스 구조로 번역하고, 사용자가 실제로 행동할 수 있는 제품 흐름을 설계합니다.</w:t>
+        <w:t>대표자는 외식업 자영업자의 문제를 서비스 구조로 번역하고, 사용자가 실제로 행동할 수 있는 제품 흐름을 설계합니다.</w:t>
       </w:r>
     </w:p>
     <w:p>
@@ -16287,31 +16992,50 @@
           <w:rFonts w:ascii="맑은 고딕" w:eastAsia="맑은 고딕" w:hAnsi="맑은 고딕"/>
           <w:sz w:val="20"/>
         </w:rPr>
-        <w:t>특히 PULSE의 핵심 가치인 “분석 결과를 행동으로 연결하는 제품 구조”를 기획 단계부터 주도했으며, KCI 등재 논문을 통해 문제-해결 구조를 체계적으로 정리한 경험이 있습니다.</w:t>
+        <w:t xml:space="preserve">특히 PULSE의 핵심 가치인 </w:t>
       </w:r>
-    </w:p>
-    <w:p>
-      <w:pPr>
+      <w:r>
         <w:rPr>
           <w:rFonts w:ascii="맑은 고딕" w:eastAsia="맑은 고딕" w:hAnsi="맑은 고딕"/>
           <w:sz w:val="20"/>
         </w:rPr>
-      </w:pPr>
+        <w:t>‘</w:t>
+      </w:r>
       <w:r>
         <w:rPr>
           <w:rFonts w:ascii="맑은 고딕" w:eastAsia="맑은 고딕" w:hAnsi="맑은 고딕"/>
           <w:sz w:val="20"/>
         </w:rPr>
-        <w:t>연구와 구현을 함께 제시할 수 있는 점은 팀의 강점입니다.</w:t>
+        <w:t>분석 결과를 행동으로 연결하는 제품 구조</w:t>
+      </w:r>
+      <w:r>
+        <w:rPr>
+          <w:rFonts w:ascii="맑은 고딕" w:eastAsia="맑은 고딕" w:hAnsi="맑은 고딕"/>
+          <w:sz w:val="20"/>
+        </w:rPr>
+        <w:t>’</w:t>
+      </w:r>
+      <w:proofErr w:type="spellStart"/>
+      <w:r>
+        <w:rPr>
+          <w:rFonts w:ascii="맑은 고딕" w:eastAsia="맑은 고딕" w:hAnsi="맑은 고딕"/>
+          <w:sz w:val="20"/>
+        </w:rPr>
+        <w:t>를</w:t>
+      </w:r>
+      <w:proofErr w:type="spellEnd"/>
+      <w:r>
+        <w:rPr>
+          <w:rFonts w:ascii="맑은 고딕" w:eastAsia="맑은 고딕" w:hAnsi="맑은 고딕"/>
+          <w:sz w:val="20"/>
+        </w:rPr>
+        <w:t xml:space="preserve"> 기획 단계부터 주도했으며, KCI 등재 논문을 통해 문제-해결 구조를 체계적으로 정리한 경험이 있습니다.</w:t>
       </w:r>
     </w:p>
     <w:p>
       <w:pPr>
         <w:pStyle w:val="a4"/>
-        <w:numPr>
-          <w:ilvl w:val="0"/>
-          <w:numId w:val="4"/>
-        </w:numPr>
+        <w:ind w:left="412"/>
         <w:rPr>
           <w:rFonts w:ascii="맑은 고딕" w:eastAsia="맑은 고딕" w:hAnsi="맑은 고딕"/>
           <w:sz w:val="20"/>
@@ -16323,38 +17047,8 @@
           <w:rFonts w:ascii="맑은 고딕" w:eastAsia="맑은 고딕" w:hAnsi="맑은 고딕"/>
           <w:sz w:val="20"/>
         </w:rPr>
-        <w:t>[별첨2제출 가능: 팀 역할 구조도]</w:t>
+        <w:t>연구와 구현을 함께 제시할 수 있는 점은 팀의 강점입니다.</w:t>
       </w:r>
-    </w:p>
-    <w:p>
-      <w:pPr>
-        <w:rPr>
-          <w:rFonts w:ascii="맑은 고딕" w:eastAsia="맑은 고딕" w:hAnsi="맑은 고딕"/>
-          <w:b/>
-          <w:sz w:val="20"/>
-          <w:szCs w:val="24"/>
-        </w:rPr>
-      </w:pPr>
-    </w:p>
-    <w:p>
-      <w:pPr>
-        <w:rPr>
-          <w:rFonts w:ascii="맑은 고딕" w:eastAsia="맑은 고딕" w:hAnsi="맑은 고딕"/>
-          <w:b/>
-          <w:sz w:val="20"/>
-          <w:szCs w:val="24"/>
-        </w:rPr>
-      </w:pPr>
-    </w:p>
-    <w:p>
-      <w:pPr>
-        <w:rPr>
-          <w:rFonts w:ascii="맑은 고딕" w:eastAsia="맑은 고딕" w:hAnsi="맑은 고딕"/>
-          <w:b/>
-          <w:sz w:val="20"/>
-          <w:szCs w:val="24"/>
-        </w:rPr>
-      </w:pPr>
     </w:p>
     <w:p>
       <w:pPr>
@@ -16387,6 +17081,7 @@
           <w:szCs w:val="26"/>
         </w:rPr>
       </w:pPr>
+      <w:proofErr w:type="gramStart"/>
       <w:r>
         <w:rPr>
           <w:rFonts w:ascii="맑은 고딕" w:eastAsia="맑은 고딕" w:hAnsi="맑은 고딕"/>
@@ -16412,6 +17107,7 @@
         </w:rPr>
         <w:t>팀</w:t>
       </w:r>
+      <w:proofErr w:type="gramEnd"/>
       <w:r>
         <w:rPr>
           <w:rFonts w:ascii="맑은 고딕" w:eastAsia="맑은 고딕" w:hAnsi="맑은 고딕"/>
@@ -16427,7 +17123,16 @@
           <w:sz w:val="20"/>
           <w:szCs w:val="26"/>
         </w:rPr>
-        <w:t>구성(안)</w:t>
+        <w:t>구성(안</w:t>
+      </w:r>
+      <w:proofErr w:type="gramStart"/>
+      <w:r>
+        <w:rPr>
+          <w:rFonts w:ascii="맑은 고딕" w:eastAsia="맑은 고딕" w:hAnsi="맑은 고딕"/>
+          <w:sz w:val="20"/>
+          <w:szCs w:val="26"/>
+        </w:rPr>
+        <w:t>)</w:t>
       </w:r>
       <w:r>
         <w:rPr>
@@ -16447,6 +17152,7 @@
         </w:rPr>
         <w:t>&gt;</w:t>
       </w:r>
+      <w:proofErr w:type="gramEnd"/>
     </w:p>
     <w:p>
       <w:pPr>
@@ -16838,12 +17544,21 @@
                 <w:sz w:val="20"/>
               </w:rPr>
             </w:pPr>
-            <w:r>
-              <w:rPr>
-                <w:rFonts w:ascii="맑은 고딕" w:eastAsia="맑은 고딕" w:hAnsi="맑은 고딕"/>
-                <w:sz w:val="20"/>
-              </w:rPr>
-              <w:t>대표자 / AI·CTO</w:t>
+            <w:proofErr w:type="gramStart"/>
+            <w:r>
+              <w:rPr>
+                <w:rFonts w:ascii="맑은 고딕" w:eastAsia="맑은 고딕" w:hAnsi="맑은 고딕"/>
+                <w:sz w:val="20"/>
+              </w:rPr>
+              <w:t>대표자 /</w:t>
+            </w:r>
+            <w:proofErr w:type="gramEnd"/>
+            <w:r>
+              <w:rPr>
+                <w:rFonts w:ascii="맑은 고딕" w:eastAsia="맑은 고딕" w:hAnsi="맑은 고딕"/>
+                <w:sz w:val="20"/>
+              </w:rPr>
+              <w:t xml:space="preserve"> AI·CTO</w:t>
             </w:r>
           </w:p>
         </w:tc>
@@ -16866,14 +17581,30 @@
                 <w:rFonts w:ascii="맑은 고딕" w:eastAsia="맑은 고딕" w:hAnsi="맑은 고딕"/>
                 <w:sz w:val="20"/>
               </w:rPr>
-              <w:t>윤*하</w:t>
-            </w:r>
-            <w:r>
-              <w:rPr>
-                <w:rFonts w:ascii="맑은 고딕" w:eastAsia="맑은 고딕" w:hAnsi="맑은 고딕"/>
-                <w:sz w:val="20"/>
-              </w:rPr>
-              <w:t xml:space="preserve"> / 서비스 기획, AI 전략, 기술 총괄</w:t>
+              <w:t>윤*</w:t>
+            </w:r>
+            <w:proofErr w:type="gramStart"/>
+            <w:r>
+              <w:rPr>
+                <w:rFonts w:ascii="맑은 고딕" w:eastAsia="맑은 고딕" w:hAnsi="맑은 고딕"/>
+                <w:sz w:val="20"/>
+              </w:rPr>
+              <w:t>하</w:t>
+            </w:r>
+            <w:r>
+              <w:rPr>
+                <w:rFonts w:ascii="맑은 고딕" w:eastAsia="맑은 고딕" w:hAnsi="맑은 고딕"/>
+                <w:sz w:val="20"/>
+              </w:rPr>
+              <w:t xml:space="preserve"> /</w:t>
+            </w:r>
+            <w:proofErr w:type="gramEnd"/>
+            <w:r>
+              <w:rPr>
+                <w:rFonts w:ascii="맑은 고딕" w:eastAsia="맑은 고딕" w:hAnsi="맑은 고딕"/>
+                <w:sz w:val="20"/>
+              </w:rPr>
+              <w:t xml:space="preserve"> 서비스 기획, AI 전략, 기술 총괄</w:t>
             </w:r>
           </w:p>
         </w:tc>
@@ -16903,7 +17634,23 @@
                 <w:rFonts w:ascii="맑은 고딕" w:eastAsia="맑은 고딕" w:hAnsi="맑은 고딕"/>
                 <w:sz w:val="20"/>
               </w:rPr>
-              <w:t xml:space="preserve"> 4학년 재학 / AI 구조 설계 및 프로젝트 총괄 역량</w:t>
+              <w:t xml:space="preserve"> 4학년 </w:t>
+            </w:r>
+            <w:proofErr w:type="gramStart"/>
+            <w:r>
+              <w:rPr>
+                <w:rFonts w:ascii="맑은 고딕" w:eastAsia="맑은 고딕" w:hAnsi="맑은 고딕"/>
+                <w:sz w:val="20"/>
+              </w:rPr>
+              <w:t>재학 /</w:t>
+            </w:r>
+            <w:proofErr w:type="gramEnd"/>
+            <w:r>
+              <w:rPr>
+                <w:rFonts w:ascii="맑은 고딕" w:eastAsia="맑은 고딕" w:hAnsi="맑은 고딕"/>
+                <w:sz w:val="20"/>
+              </w:rPr>
+              <w:t xml:space="preserve"> AI 구조 설계 및 프로젝트 총괄 역량</w:t>
             </w:r>
           </w:p>
         </w:tc>
@@ -16991,14 +17738,30 @@
                 <w:rFonts w:ascii="맑은 고딕" w:eastAsia="맑은 고딕" w:hAnsi="맑은 고딕"/>
                 <w:sz w:val="20"/>
               </w:rPr>
-              <w:t>노*경</w:t>
-            </w:r>
-            <w:r>
-              <w:rPr>
-                <w:rFonts w:ascii="맑은 고딕" w:eastAsia="맑은 고딕" w:hAnsi="맑은 고딕"/>
-                <w:sz w:val="20"/>
-              </w:rPr>
-              <w:t xml:space="preserve"> / 마케팅, 기획, 디자인</w:t>
+              <w:t>노*</w:t>
+            </w:r>
+            <w:proofErr w:type="gramStart"/>
+            <w:r>
+              <w:rPr>
+                <w:rFonts w:ascii="맑은 고딕" w:eastAsia="맑은 고딕" w:hAnsi="맑은 고딕"/>
+                <w:sz w:val="20"/>
+              </w:rPr>
+              <w:t>경</w:t>
+            </w:r>
+            <w:r>
+              <w:rPr>
+                <w:rFonts w:ascii="맑은 고딕" w:eastAsia="맑은 고딕" w:hAnsi="맑은 고딕"/>
+                <w:sz w:val="20"/>
+              </w:rPr>
+              <w:t xml:space="preserve"> /</w:t>
+            </w:r>
+            <w:proofErr w:type="gramEnd"/>
+            <w:r>
+              <w:rPr>
+                <w:rFonts w:ascii="맑은 고딕" w:eastAsia="맑은 고딕" w:hAnsi="맑은 고딕"/>
+                <w:sz w:val="20"/>
+              </w:rPr>
+              <w:t xml:space="preserve"> 마케팅, 기획, 디자인</w:t>
             </w:r>
           </w:p>
         </w:tc>
@@ -17018,7 +17781,23 @@
                 <w:rFonts w:ascii="맑은 고딕" w:eastAsia="맑은 고딕" w:hAnsi="맑은 고딕"/>
                 <w:sz w:val="20"/>
               </w:rPr>
-              <w:t>대학교 4학년 재학 / 마케팅 기획, 서비스 기획, 디자인 역량</w:t>
+              <w:t xml:space="preserve">대학교 4학년 </w:t>
+            </w:r>
+            <w:proofErr w:type="gramStart"/>
+            <w:r>
+              <w:rPr>
+                <w:rFonts w:ascii="맑은 고딕" w:eastAsia="맑은 고딕" w:hAnsi="맑은 고딕"/>
+                <w:sz w:val="20"/>
+              </w:rPr>
+              <w:t>재학 /</w:t>
+            </w:r>
+            <w:proofErr w:type="gramEnd"/>
+            <w:r>
+              <w:rPr>
+                <w:rFonts w:ascii="맑은 고딕" w:eastAsia="맑은 고딕" w:hAnsi="맑은 고딕"/>
+                <w:sz w:val="20"/>
+              </w:rPr>
+              <w:t xml:space="preserve"> 마케팅 기획, 서비스 기획, 디자인 역량</w:t>
             </w:r>
           </w:p>
         </w:tc>
@@ -17103,14 +17882,46 @@
                 <w:rFonts w:ascii="맑은 고딕" w:eastAsia="맑은 고딕" w:hAnsi="맑은 고딕"/>
                 <w:sz w:val="20"/>
               </w:rPr>
-              <w:t>김*린</w:t>
-            </w:r>
-            <w:r>
-              <w:rPr>
-                <w:rFonts w:ascii="맑은 고딕" w:eastAsia="맑은 고딕" w:hAnsi="맑은 고딕"/>
-                <w:sz w:val="20"/>
-              </w:rPr>
-              <w:t xml:space="preserve"> / 프론트엔드 개발</w:t>
+              <w:t>김*</w:t>
+            </w:r>
+            <w:proofErr w:type="gramStart"/>
+            <w:r>
+              <w:rPr>
+                <w:rFonts w:ascii="맑은 고딕" w:eastAsia="맑은 고딕" w:hAnsi="맑은 고딕"/>
+                <w:sz w:val="20"/>
+              </w:rPr>
+              <w:t>린</w:t>
+            </w:r>
+            <w:r>
+              <w:rPr>
+                <w:rFonts w:ascii="맑은 고딕" w:eastAsia="맑은 고딕" w:hAnsi="맑은 고딕"/>
+                <w:sz w:val="20"/>
+              </w:rPr>
+              <w:t xml:space="preserve"> /</w:t>
+            </w:r>
+            <w:proofErr w:type="gramEnd"/>
+            <w:r>
+              <w:rPr>
+                <w:rFonts w:ascii="맑은 고딕" w:eastAsia="맑은 고딕" w:hAnsi="맑은 고딕"/>
+                <w:sz w:val="20"/>
+              </w:rPr>
+              <w:t xml:space="preserve"> </w:t>
+            </w:r>
+            <w:proofErr w:type="spellStart"/>
+            <w:r>
+              <w:rPr>
+                <w:rFonts w:ascii="맑은 고딕" w:eastAsia="맑은 고딕" w:hAnsi="맑은 고딕"/>
+                <w:sz w:val="20"/>
+              </w:rPr>
+              <w:t>프론트엔드</w:t>
+            </w:r>
+            <w:proofErr w:type="spellEnd"/>
+            <w:r>
+              <w:rPr>
+                <w:rFonts w:ascii="맑은 고딕" w:eastAsia="맑은 고딕" w:hAnsi="맑은 고딕"/>
+                <w:sz w:val="20"/>
+              </w:rPr>
+              <w:t xml:space="preserve"> 개발</w:t>
             </w:r>
           </w:p>
         </w:tc>
@@ -17130,7 +17941,23 @@
                 <w:rFonts w:ascii="맑은 고딕" w:eastAsia="맑은 고딕" w:hAnsi="맑은 고딕"/>
                 <w:sz w:val="20"/>
               </w:rPr>
-              <w:t>대학교 4학년 재학 / React 기반 UI 구현 및 사용자 경험 설계 역량</w:t>
+              <w:t xml:space="preserve">대학교 4학년 </w:t>
+            </w:r>
+            <w:proofErr w:type="gramStart"/>
+            <w:r>
+              <w:rPr>
+                <w:rFonts w:ascii="맑은 고딕" w:eastAsia="맑은 고딕" w:hAnsi="맑은 고딕"/>
+                <w:sz w:val="20"/>
+              </w:rPr>
+              <w:t>재학 /</w:t>
+            </w:r>
+            <w:proofErr w:type="gramEnd"/>
+            <w:r>
+              <w:rPr>
+                <w:rFonts w:ascii="맑은 고딕" w:eastAsia="맑은 고딕" w:hAnsi="맑은 고딕"/>
+                <w:sz w:val="20"/>
+              </w:rPr>
+              <w:t xml:space="preserve"> React 기반 UI 구현 및 사용자 경험 설계 역량</w:t>
             </w:r>
           </w:p>
         </w:tc>
@@ -17212,22 +18039,46 @@
                 <w:rFonts w:ascii="맑은 고딕" w:eastAsia="맑은 고딕" w:hAnsi="맑은 고딕"/>
                 <w:sz w:val="20"/>
               </w:rPr>
-              <w:t>오*서</w:t>
-            </w:r>
-            <w:r>
-              <w:rPr>
-                <w:rFonts w:ascii="맑은 고딕" w:eastAsia="맑은 고딕" w:hAnsi="맑은 고딕"/>
-                <w:sz w:val="20"/>
-              </w:rPr>
-              <w:t xml:space="preserve"> / 백엔드 </w:t>
-            </w:r>
-            <w:r>
-              <w:rPr>
-                <w:rFonts w:ascii="맑은 고딕" w:eastAsia="맑은 고딕" w:hAnsi="맑은 고딕"/>
-                <w:sz w:val="20"/>
-              </w:rPr>
-              <w:lastRenderedPageBreak/>
-              <w:t>개발</w:t>
+              <w:t>오*</w:t>
+            </w:r>
+            <w:proofErr w:type="gramStart"/>
+            <w:r>
+              <w:rPr>
+                <w:rFonts w:ascii="맑은 고딕" w:eastAsia="맑은 고딕" w:hAnsi="맑은 고딕"/>
+                <w:sz w:val="20"/>
+              </w:rPr>
+              <w:t>서</w:t>
+            </w:r>
+            <w:r>
+              <w:rPr>
+                <w:rFonts w:ascii="맑은 고딕" w:eastAsia="맑은 고딕" w:hAnsi="맑은 고딕"/>
+                <w:sz w:val="20"/>
+              </w:rPr>
+              <w:t xml:space="preserve"> /</w:t>
+            </w:r>
+            <w:proofErr w:type="gramEnd"/>
+            <w:r>
+              <w:rPr>
+                <w:rFonts w:ascii="맑은 고딕" w:eastAsia="맑은 고딕" w:hAnsi="맑은 고딕"/>
+                <w:sz w:val="20"/>
+              </w:rPr>
+              <w:t xml:space="preserve"> </w:t>
+            </w:r>
+            <w:proofErr w:type="spellStart"/>
+            <w:r>
+              <w:rPr>
+                <w:rFonts w:ascii="맑은 고딕" w:eastAsia="맑은 고딕" w:hAnsi="맑은 고딕"/>
+                <w:sz w:val="20"/>
+              </w:rPr>
+              <w:t>백엔드</w:t>
+            </w:r>
+            <w:proofErr w:type="spellEnd"/>
+            <w:r>
+              <w:rPr>
+                <w:rFonts w:ascii="맑은 고딕" w:eastAsia="맑은 고딕" w:hAnsi="맑은 고딕"/>
+                <w:sz w:val="20"/>
+              </w:rPr>
+              <w:t xml:space="preserve"> 개발</w:t>
             </w:r>
           </w:p>
         </w:tc>
@@ -17247,16 +18098,23 @@
                 <w:rFonts w:ascii="맑은 고딕" w:eastAsia="맑은 고딕" w:hAnsi="맑은 고딕"/>
                 <w:sz w:val="20"/>
               </w:rPr>
-              <w:lastRenderedPageBreak/>
-              <w:t xml:space="preserve">대학교 4학년 재학 / Spring Boot 기반 API 및 </w:t>
-            </w:r>
-            <w:r>
-              <w:rPr>
-                <w:rFonts w:ascii="맑은 고딕" w:eastAsia="맑은 고딕" w:hAnsi="맑은 고딕"/>
-                <w:sz w:val="20"/>
-              </w:rPr>
-              <w:lastRenderedPageBreak/>
-              <w:t>서버 연동 역량</w:t>
+              <w:t xml:space="preserve">대학교 4학년 </w:t>
+            </w:r>
+            <w:proofErr w:type="gramStart"/>
+            <w:r>
+              <w:rPr>
+                <w:rFonts w:ascii="맑은 고딕" w:eastAsia="맑은 고딕" w:hAnsi="맑은 고딕"/>
+                <w:sz w:val="20"/>
+              </w:rPr>
+              <w:t>재학 /</w:t>
+            </w:r>
+            <w:proofErr w:type="gramEnd"/>
+            <w:r>
+              <w:rPr>
+                <w:rFonts w:ascii="맑은 고딕" w:eastAsia="맑은 고딕" w:hAnsi="맑은 고딕"/>
+                <w:sz w:val="20"/>
+              </w:rPr>
+              <w:t xml:space="preserve"> Spring Boot 기반 API 및 서버 연동 역량</w:t>
             </w:r>
           </w:p>
         </w:tc>
@@ -17276,7 +18134,6 @@
                 <w:rFonts w:ascii="맑은 고딕" w:eastAsia="맑은 고딕" w:hAnsi="맑은 고딕"/>
                 <w:sz w:val="20"/>
               </w:rPr>
-              <w:lastRenderedPageBreak/>
               <w:t>완료</w:t>
             </w:r>
           </w:p>
@@ -17302,6 +18159,7 @@
           <w:szCs w:val="26"/>
         </w:rPr>
       </w:pPr>
+      <w:proofErr w:type="gramStart"/>
       <w:r>
         <w:rPr>
           <w:rFonts w:ascii="맑은 고딕" w:eastAsia="맑은 고딕" w:hAnsi="맑은 고딕"/>
@@ -17327,6 +18185,7 @@
         </w:rPr>
         <w:t>협력</w:t>
       </w:r>
+      <w:proofErr w:type="gramEnd"/>
       <w:r>
         <w:rPr>
           <w:rFonts w:ascii="맑은 고딕" w:eastAsia="맑은 고딕" w:hAnsi="맑은 고딕"/>
@@ -17404,6 +18263,7 @@
         </w:rPr>
         <w:t xml:space="preserve"> </w:t>
       </w:r>
+      <w:proofErr w:type="gramStart"/>
       <w:r>
         <w:rPr>
           <w:rFonts w:ascii="맑은 고딕" w:eastAsia="맑은 고딕" w:hAnsi="맑은 고딕"/>
@@ -17430,6 +18290,7 @@
         </w:rPr>
         <w:t>&gt;</w:t>
       </w:r>
+      <w:proofErr w:type="gramEnd"/>
     </w:p>
     <w:p>
       <w:pPr>
@@ -17498,6 +18359,7 @@
                 <w:sz w:val="20"/>
                 <w:szCs w:val="20"/>
               </w:rPr>
+              <w:lastRenderedPageBreak/>
               <w:t>구분</w:t>
             </w:r>
           </w:p>
@@ -17744,12 +18606,21 @@
                 <w:sz w:val="20"/>
               </w:rPr>
             </w:pPr>
-            <w:r>
-              <w:rPr>
-                <w:rFonts w:ascii="맑은 고딕" w:eastAsia="맑은 고딕" w:hAnsi="맑은 고딕"/>
-                <w:sz w:val="20"/>
-              </w:rPr>
-              <w:t>소상공인시장진흥공단 또는 지역 소상공인지원센터(협력 추진 대상)</w:t>
+            <w:proofErr w:type="spellStart"/>
+            <w:r>
+              <w:rPr>
+                <w:rFonts w:ascii="맑은 고딕" w:eastAsia="맑은 고딕" w:hAnsi="맑은 고딕"/>
+                <w:sz w:val="20"/>
+              </w:rPr>
+              <w:t>소상공인시장진흥공단</w:t>
+            </w:r>
+            <w:proofErr w:type="spellEnd"/>
+            <w:r>
+              <w:rPr>
+                <w:rFonts w:ascii="맑은 고딕" w:eastAsia="맑은 고딕" w:hAnsi="맑은 고딕"/>
+                <w:sz w:val="20"/>
+              </w:rPr>
+              <w:t xml:space="preserve"> 또는 지역 소상공인지원센터(협력 추진 대상)</w:t>
             </w:r>
           </w:p>
         </w:tc>
@@ -17858,12 +18729,21 @@
                 <w:sz w:val="20"/>
               </w:rPr>
             </w:pPr>
-            <w:r>
-              <w:rPr>
-                <w:rFonts w:ascii="맑은 고딕" w:eastAsia="맑은 고딕" w:hAnsi="맑은 고딕"/>
-                <w:sz w:val="20"/>
-              </w:rPr>
-              <w:t>한국외식업중앙회 지역 지부(협력 추진 대상)</w:t>
+            <w:proofErr w:type="spellStart"/>
+            <w:r>
+              <w:rPr>
+                <w:rFonts w:ascii="맑은 고딕" w:eastAsia="맑은 고딕" w:hAnsi="맑은 고딕"/>
+                <w:sz w:val="20"/>
+              </w:rPr>
+              <w:t>한국외식업중앙회</w:t>
+            </w:r>
+            <w:proofErr w:type="spellEnd"/>
+            <w:r>
+              <w:rPr>
+                <w:rFonts w:ascii="맑은 고딕" w:eastAsia="맑은 고딕" w:hAnsi="맑은 고딕"/>
+                <w:sz w:val="20"/>
+              </w:rPr>
+              <w:t xml:space="preserve"> 지역 지부(협력 추진 대상)</w:t>
             </w:r>
           </w:p>
         </w:tc>
@@ -18083,7 +18963,6 @@
         <w:docPartUnique/>
       </w:docPartObj>
     </w:sdtPr>
-    <w:sdtEndPr/>
     <w:sdtContent>
       <w:p>
         <w:pPr>

</xml_diff>